<commit_message>
Implement CSV to Database streaming import and properties view
</commit_message>
<xml_diff>
--- a/supabase/Banco de Dados - Imoveis Caixa App.docx
+++ b/supabase/Banco de Dados - Imoveis Caixa App.docx
@@ -299,10 +299,7 @@
         <w:t>Endereço</w:t>
       </w:r>
       <w:r>
-        <w:t xml:space="preserve">; </w:t>
-      </w:r>
-      <w:r>
-        <w:t xml:space="preserve">passa a ser chamado </w:t>
+        <w:t xml:space="preserve">; passa a ser chamado </w:t>
       </w:r>
       <w:r>
         <w:rPr>
@@ -448,6 +445,33 @@
         <w:t xml:space="preserve"> e seus respectivos conteúdos como segue:</w:t>
       </w:r>
     </w:p>
+    <w:p/>
+    <w:p>
+      <w:r>
+        <w:t>Você tem alguma coluna no seu banco atual para controlar o </w:t>
+      </w:r>
+      <w:r>
+        <w:rPr>
+          <w:b/>
+          <w:bCs/>
+        </w:rPr>
+        <w:t>status</w:t>
+      </w:r>
+      <w:r>
+        <w:t> da raspagem? (Por exemplo, uma coluna chamada </w:t>
+      </w:r>
+      <w:proofErr w:type="spellStart"/>
+      <w:r>
+        <w:t>status_raspagem</w:t>
+      </w:r>
+      <w:proofErr w:type="spellEnd"/>
+      <w:r>
+        <w:t> que pode receber "Pendente", "Concluído" ou "Erro"). Isso é crucial para que, se o robô parar na página 5.000, ele saiba recomeçar da 5.001.</w:t>
+      </w:r>
+    </w:p>
+    <w:p/>
+    <w:p/>
+    <w:p/>
     <w:p>
       <w:pPr>
         <w:rPr>
@@ -520,58 +544,39 @@
     </w:p>
     <w:p>
       <w:r>
-        <w:lastRenderedPageBreak/>
-        <w:t>Não iremos baixar est</w:t>
-      </w:r>
-      <w:r>
-        <w:t>e</w:t>
-      </w:r>
-      <w:r>
+        <w:t xml:space="preserve">Não iremos baixar este arquivo para o nosso site, iremos usar este link de direcionamento. Na </w:t>
+      </w:r>
+      <w:r>
+        <w:rPr>
+          <w:b/>
+          <w:bCs/>
+        </w:rPr>
+        <w:t>‘pagina-do-</w:t>
+      </w:r>
+      <w:proofErr w:type="spellStart"/>
+      <w:r>
+        <w:rPr>
+          <w:b/>
+          <w:bCs/>
+        </w:rPr>
+        <w:t>imovel</w:t>
+      </w:r>
+      <w:proofErr w:type="spellEnd"/>
+      <w:r>
+        <w:rPr>
+          <w:b/>
+          <w:bCs/>
+        </w:rPr>
+        <w:t>’</w:t>
+      </w:r>
+      <w:r>
+        <w:rPr>
+          <w:b/>
+          <w:bCs/>
+        </w:rPr>
         <w:t xml:space="preserve"> </w:t>
       </w:r>
       <w:r>
-        <w:t>arquivo</w:t>
-      </w:r>
-      <w:r>
-        <w:t xml:space="preserve"> para o nosso site, iremos usar este link </w:t>
-      </w:r>
-      <w:r>
-        <w:t>de direcionamento. N</w:t>
-      </w:r>
-      <w:r>
-        <w:t xml:space="preserve">a </w:t>
-      </w:r>
-      <w:r>
-        <w:rPr>
-          <w:b/>
-          <w:bCs/>
-        </w:rPr>
-        <w:t>‘pagina-do-</w:t>
-      </w:r>
-      <w:proofErr w:type="spellStart"/>
-      <w:r>
-        <w:rPr>
-          <w:b/>
-          <w:bCs/>
-        </w:rPr>
-        <w:t>imovel</w:t>
-      </w:r>
-      <w:proofErr w:type="spellEnd"/>
-      <w:r>
-        <w:rPr>
-          <w:b/>
-          <w:bCs/>
-        </w:rPr>
-        <w:t>’</w:t>
-      </w:r>
-      <w:r>
-        <w:rPr>
-          <w:b/>
-          <w:bCs/>
-        </w:rPr>
-        <w:t xml:space="preserve"> </w:t>
-      </w:r>
-      <w:r>
         <w:t>iremos ter um botão, que acionado vai abrir este documento em uma nova página.</w:t>
       </w:r>
     </w:p>
@@ -592,19 +597,7 @@
         <w:rPr>
           <w:color w:val="4472C4" w:themeColor="accent1"/>
         </w:rPr>
-        <w:t>link-</w:t>
-      </w:r>
-      <w:r>
-        <w:rPr>
-          <w:color w:val="4472C4" w:themeColor="accent1"/>
-        </w:rPr>
-        <w:t>i</w:t>
-      </w:r>
-      <w:r>
-        <w:rPr>
-          <w:color w:val="4472C4" w:themeColor="accent1"/>
-        </w:rPr>
-        <w:t>magem</w:t>
+        <w:t>link-imagem</w:t>
       </w:r>
       <w:r>
         <w:rPr>
@@ -1130,248 +1123,615 @@
         <w:rPr>
           <w:color w:val="ED7D31" w:themeColor="accent2"/>
         </w:rPr>
+        <w:t xml:space="preserve">] </w:t>
+      </w:r>
+      <w:r>
+        <w:t xml:space="preserve">E TABELA </w:t>
+      </w:r>
+      <w:r>
+        <w:rPr>
+          <w:color w:val="7B7B7B" w:themeColor="accent3" w:themeShade="BF"/>
+        </w:rPr>
+        <w:t>[</w:t>
+      </w:r>
+      <w:proofErr w:type="spellStart"/>
+      <w:r>
+        <w:rPr>
+          <w:color w:val="7B7B7B" w:themeColor="accent3" w:themeShade="BF"/>
+        </w:rPr>
+        <w:t>im</w:t>
+      </w:r>
+      <w:r>
+        <w:rPr>
+          <w:color w:val="7B7B7B" w:themeColor="accent3" w:themeShade="BF"/>
+        </w:rPr>
+        <w:t>o</w:t>
+      </w:r>
+      <w:r>
+        <w:rPr>
+          <w:color w:val="7B7B7B" w:themeColor="accent3" w:themeShade="BF"/>
+        </w:rPr>
+        <w:t>vel-</w:t>
+      </w:r>
+      <w:r>
+        <w:rPr>
+          <w:color w:val="7B7B7B" w:themeColor="accent3" w:themeShade="BF"/>
+        </w:rPr>
+        <w:t>atualizacoes</w:t>
+      </w:r>
+      <w:proofErr w:type="spellEnd"/>
+      <w:r>
+        <w:rPr>
+          <w:color w:val="7B7B7B" w:themeColor="accent3" w:themeShade="BF"/>
+        </w:rPr>
         <w:t>]</w:t>
       </w:r>
       <w:r>
         <w:rPr>
+          <w:color w:val="7B7B7B" w:themeColor="accent3" w:themeShade="BF"/>
+        </w:rPr>
+        <w:t xml:space="preserve"> </w:t>
+      </w:r>
+      <w:r>
+        <w:t xml:space="preserve">PARA CRIAR REFERENCIA COM A TABELA </w:t>
+      </w:r>
+      <w:r>
+        <w:rPr>
+          <w:b/>
+          <w:bCs/>
+          <w:color w:val="4472C4" w:themeColor="accent1"/>
+        </w:rPr>
+        <w:t>[</w:t>
+      </w:r>
+      <w:proofErr w:type="spellStart"/>
+      <w:r>
+        <w:rPr>
+          <w:b/>
+          <w:bCs/>
+          <w:color w:val="4472C4" w:themeColor="accent1"/>
+        </w:rPr>
+        <w:t>imoveis</w:t>
+      </w:r>
+      <w:proofErr w:type="spellEnd"/>
+      <w:r>
+        <w:rPr>
+          <w:b/>
+          <w:bCs/>
+          <w:color w:val="4472C4" w:themeColor="accent1"/>
+        </w:rPr>
+        <w:t>]</w:t>
+      </w:r>
+    </w:p>
+    <w:p>
+      <w:r>
+        <w:t>A</w:t>
+      </w:r>
+      <w:r>
+        <w:t xml:space="preserve"> tabela </w:t>
+      </w:r>
+      <w:r>
+        <w:rPr>
           <w:color w:val="ED7D31" w:themeColor="accent2"/>
         </w:rPr>
+        <w:t xml:space="preserve">[atualizações] </w:t>
+      </w:r>
+      <w:r>
+        <w:t>vai fazer criar um histórico d</w:t>
+      </w:r>
+      <w:r>
+        <w:t>os valores dos campos abaixo em relação a uma data específica: Nesta tabela os dados terão origens diferentes como vou informar:</w:t>
+      </w:r>
+    </w:p>
+    <w:p>
+      <w:r>
+        <w:t xml:space="preserve">Os </w:t>
+      </w:r>
+      <w:r>
+        <w:t xml:space="preserve">valores </w:t>
+      </w:r>
+      <w:r>
+        <w:t>que vem da tabela original:</w:t>
+      </w:r>
+    </w:p>
+    <w:p>
+      <w:r>
+        <w:rPr>
+          <w:color w:val="4472C4" w:themeColor="accent1"/>
+        </w:rPr>
+        <w:t>[modalidade]</w:t>
+      </w:r>
+      <w:r>
+        <w:t xml:space="preserve">, </w:t>
+      </w:r>
+      <w:r>
+        <w:rPr>
+          <w:color w:val="4472C4" w:themeColor="accent1"/>
+        </w:rPr>
+        <w:t>[data]</w:t>
+      </w:r>
+      <w:r>
+        <w:rPr>
+          <w:color w:val="4472C4" w:themeColor="accent1"/>
+        </w:rPr>
+        <w:t xml:space="preserve">, </w:t>
+      </w:r>
+      <w:r>
+        <w:rPr>
+          <w:color w:val="4472C4" w:themeColor="accent1"/>
+        </w:rPr>
+        <w:t>[valor-venda]</w:t>
+      </w:r>
+      <w:r>
+        <w:rPr>
+          <w:color w:val="4472C4" w:themeColor="accent1"/>
+        </w:rPr>
+        <w:t xml:space="preserve">, </w:t>
+      </w:r>
+      <w:r>
+        <w:rPr>
+          <w:color w:val="4472C4" w:themeColor="accent1"/>
+        </w:rPr>
+        <w:t>[desconto-percentual]</w:t>
+      </w:r>
+      <w:r>
+        <w:rPr>
+          <w:color w:val="4472C4" w:themeColor="accent1"/>
+        </w:rPr>
+        <w:t xml:space="preserve">, </w:t>
+      </w:r>
+      <w:r>
+        <w:rPr>
+          <w:color w:val="4472C4" w:themeColor="accent1"/>
+        </w:rPr>
+        <w:t>[valor-</w:t>
+      </w:r>
+      <w:proofErr w:type="spellStart"/>
+      <w:r>
+        <w:rPr>
+          <w:color w:val="4472C4" w:themeColor="accent1"/>
+        </w:rPr>
+        <w:t>avaliacao</w:t>
+      </w:r>
+      <w:proofErr w:type="spellEnd"/>
+      <w:r>
+        <w:rPr>
+          <w:color w:val="4472C4" w:themeColor="accent1"/>
+        </w:rPr>
+        <w:t>]</w:t>
+      </w:r>
+      <w:r>
+        <w:rPr>
+          <w:color w:val="4472C4" w:themeColor="accent1"/>
+        </w:rPr>
         <w:t xml:space="preserve"> </w:t>
       </w:r>
       <w:r>
-        <w:t xml:space="preserve">E TABELA </w:t>
-      </w:r>
-      <w:r>
-        <w:rPr>
+        <w:rPr>
+          <w:color w:val="4472C4" w:themeColor="accent1"/>
+        </w:rPr>
+        <w:t>[</w:t>
+      </w:r>
+      <w:r>
+        <w:rPr>
+          <w:color w:val="4472C4" w:themeColor="accent1"/>
+        </w:rPr>
+        <w:t>financiamento</w:t>
+      </w:r>
+      <w:r>
+        <w:rPr>
+          <w:color w:val="4472C4" w:themeColor="accent1"/>
+        </w:rPr>
+        <w:t>]</w:t>
+      </w:r>
+      <w:r>
+        <w:rPr>
+          <w:color w:val="4472C4" w:themeColor="accent1"/>
+        </w:rPr>
+        <w:t xml:space="preserve">, </w:t>
+      </w:r>
+      <w:r>
+        <w:rPr>
+          <w:color w:val="4472C4" w:themeColor="accent1"/>
+        </w:rPr>
+        <w:t>[desconto-percentual]</w:t>
+      </w:r>
+    </w:p>
+    <w:p>
+      <w:r>
+        <w:t>Os valores que precisam ser calculados:</w:t>
+      </w:r>
+    </w:p>
+    <w:p>
+      <w:pPr>
+        <w:rPr>
+          <w:color w:val="7030A0"/>
+        </w:rPr>
+      </w:pPr>
+      <w:r>
+        <w:rPr>
+          <w:b/>
+          <w:bCs/>
           <w:color w:val="7B7B7B" w:themeColor="accent3" w:themeShade="BF"/>
         </w:rPr>
         <w:t>[</w:t>
       </w:r>
-      <w:proofErr w:type="spellStart"/>
-      <w:r>
-        <w:rPr>
+      <w:r>
+        <w:rPr>
+          <w:b/>
+          <w:bCs/>
           <w:color w:val="7B7B7B" w:themeColor="accent3" w:themeShade="BF"/>
         </w:rPr>
-        <w:t>im</w:t>
-      </w:r>
-      <w:r>
-        <w:rPr>
+        <w:t>desconto-real</w:t>
+      </w:r>
+      <w:r>
+        <w:rPr>
+          <w:b/>
+          <w:bCs/>
           <w:color w:val="7B7B7B" w:themeColor="accent3" w:themeShade="BF"/>
         </w:rPr>
-        <w:t>o</w:t>
-      </w:r>
-      <w:r>
-        <w:rPr>
+        <w:t>]</w:t>
+      </w:r>
+      <w:r>
+        <w:t xml:space="preserve"> </w:t>
+      </w:r>
+      <w:r>
+        <w:rPr>
+          <w:color w:val="7030A0"/>
+        </w:rPr>
+        <w:t>= (</w:t>
+      </w:r>
+      <w:r>
+        <w:rPr>
+          <w:color w:val="4472C4" w:themeColor="accent1"/>
+        </w:rPr>
+        <w:t>[valor-venda]</w:t>
+      </w:r>
+      <w:r>
+        <w:rPr>
+          <w:color w:val="7030A0"/>
+        </w:rPr>
+        <w:t xml:space="preserve"> - </w:t>
+      </w:r>
+      <w:r>
+        <w:rPr>
+          <w:color w:val="4472C4" w:themeColor="accent1"/>
+        </w:rPr>
+        <w:t>[valor-venda]</w:t>
+      </w:r>
+      <w:r>
+        <w:rPr>
+          <w:color w:val="7030A0"/>
+        </w:rPr>
+        <w:t xml:space="preserve">) </w:t>
+      </w:r>
+      <w:r>
+        <w:t>grava</w:t>
+      </w:r>
+      <w:r>
+        <w:t xml:space="preserve">ndo o </w:t>
+      </w:r>
+      <w:r>
+        <w:t>resultado em R$</w:t>
+      </w:r>
+    </w:p>
+    <w:p>
+      <w:pPr>
+        <w:rPr>
+          <w:color w:val="4472C4" w:themeColor="accent1"/>
+        </w:rPr>
+      </w:pPr>
+    </w:p>
+    <w:p>
+      <w:pPr>
+        <w:rPr>
+          <w:b/>
+          <w:bCs/>
           <w:color w:val="7B7B7B" w:themeColor="accent3" w:themeShade="BF"/>
         </w:rPr>
-        <w:t>vel-</w:t>
-      </w:r>
-      <w:r>
-        <w:rPr>
+      </w:pPr>
+      <w:r>
+        <w:rPr>
+          <w:color w:val="4472C4" w:themeColor="accent1"/>
+        </w:rPr>
+        <w:t xml:space="preserve">Se </w:t>
+      </w:r>
+      <w:r>
+        <w:rPr>
+          <w:b/>
+          <w:bCs/>
           <w:color w:val="7B7B7B" w:themeColor="accent3" w:themeShade="BF"/>
         </w:rPr>
-        <w:t>atualizacoes</w:t>
-      </w:r>
-      <w:proofErr w:type="spellEnd"/>
+        <w:t>[financiamento-status]</w:t>
+      </w:r>
+      <w:r>
+        <w:rPr>
+          <w:color w:val="4472C4" w:themeColor="accent1"/>
+        </w:rPr>
+        <w:t xml:space="preserve"> = SIM</w:t>
+      </w:r>
+    </w:p>
+    <w:p>
+      <w:pPr>
+        <w:rPr>
+          <w:color w:val="7030A0"/>
+        </w:rPr>
+      </w:pPr>
       <w:r>
         <w:rPr>
           <w:color w:val="7B7B7B" w:themeColor="accent3" w:themeShade="BF"/>
         </w:rPr>
+        <w:t>[</w:t>
+      </w:r>
+      <w:r>
+        <w:rPr>
+          <w:color w:val="7B7B7B" w:themeColor="accent3" w:themeShade="BF"/>
+        </w:rPr>
+        <w:t>financiamento-valor</w:t>
+      </w:r>
+      <w:r>
+        <w:rPr>
+          <w:color w:val="7B7B7B" w:themeColor="accent3" w:themeShade="BF"/>
+        </w:rPr>
+        <w:t>-</w:t>
+      </w:r>
+      <w:proofErr w:type="spellStart"/>
+      <w:r>
+        <w:rPr>
+          <w:color w:val="7B7B7B" w:themeColor="accent3" w:themeShade="BF"/>
+        </w:rPr>
+        <w:t>minimo</w:t>
+      </w:r>
+      <w:proofErr w:type="spellEnd"/>
+      <w:r>
+        <w:rPr>
+          <w:color w:val="7B7B7B" w:themeColor="accent3" w:themeShade="BF"/>
+        </w:rPr>
         <w:t>]</w:t>
       </w:r>
       <w:r>
         <w:rPr>
+          <w:color w:val="7030A0"/>
+        </w:rPr>
+        <w:t xml:space="preserve"> = </w:t>
+      </w:r>
+      <w:r>
+        <w:rPr>
+          <w:color w:val="7030A0"/>
+        </w:rPr>
+        <w:t>(</w:t>
+      </w:r>
+      <w:r>
+        <w:rPr>
+          <w:color w:val="4472C4" w:themeColor="accent1"/>
+        </w:rPr>
+        <w:t>[valor-venda]</w:t>
+      </w:r>
+      <w:r>
+        <w:rPr>
+          <w:color w:val="7030A0"/>
+        </w:rPr>
+        <w:t xml:space="preserve"> * </w:t>
+      </w:r>
+      <w:r>
+        <w:rPr>
+          <w:color w:val="70AD47" w:themeColor="accent6"/>
+        </w:rPr>
+        <w:t>[percentual-entrada-financiamento</w:t>
+      </w:r>
+      <w:r>
+        <w:rPr>
+          <w:color w:val="70AD47" w:themeColor="accent6"/>
+        </w:rPr>
+        <w:t>]</w:t>
+      </w:r>
+      <w:r>
+        <w:rPr>
+          <w:color w:val="7030A0"/>
+        </w:rPr>
+        <w:t>)</w:t>
+      </w:r>
+    </w:p>
+    <w:p>
+      <w:pPr>
+        <w:rPr>
+          <w:color w:val="7030A0"/>
+        </w:rPr>
+      </w:pPr>
+      <w:r>
+        <w:rPr>
           <w:color w:val="7B7B7B" w:themeColor="accent3" w:themeShade="BF"/>
         </w:rPr>
-        <w:t xml:space="preserve"> </w:t>
-      </w:r>
-      <w:r>
-        <w:t xml:space="preserve">PARA CRIAR REFERENCIA COM A TABELA </w:t>
-      </w:r>
-      <w:r>
-        <w:rPr>
-          <w:b/>
-          <w:bCs/>
-          <w:color w:val="4472C4" w:themeColor="accent1"/>
-        </w:rPr>
         <w:t>[</w:t>
       </w:r>
-      <w:proofErr w:type="spellStart"/>
-      <w:r>
-        <w:rPr>
-          <w:b/>
-          <w:bCs/>
-          <w:color w:val="4472C4" w:themeColor="accent1"/>
-        </w:rPr>
-        <w:t>imoveis</w:t>
-      </w:r>
-      <w:proofErr w:type="spellEnd"/>
-      <w:r>
-        <w:rPr>
-          <w:b/>
-          <w:bCs/>
-          <w:color w:val="4472C4" w:themeColor="accent1"/>
+      <w:r>
+        <w:rPr>
+          <w:color w:val="7B7B7B" w:themeColor="accent3" w:themeShade="BF"/>
+        </w:rPr>
+        <w:t>financiamento-</w:t>
+      </w:r>
+      <w:proofErr w:type="spellStart"/>
+      <w:r>
+        <w:rPr>
+          <w:color w:val="7B7B7B" w:themeColor="accent3" w:themeShade="BF"/>
+        </w:rPr>
+        <w:t>prestacao</w:t>
+      </w:r>
+      <w:proofErr w:type="spellEnd"/>
+      <w:r>
+        <w:rPr>
+          <w:color w:val="7B7B7B" w:themeColor="accent3" w:themeShade="BF"/>
         </w:rPr>
         <w:t>]</w:t>
       </w:r>
-    </w:p>
-    <w:p>
-      <w:r>
-        <w:t>A</w:t>
-      </w:r>
-      <w:r>
-        <w:t xml:space="preserve"> tabela </w:t>
-      </w:r>
-      <w:r>
-        <w:rPr>
-          <w:color w:val="ED7D31" w:themeColor="accent2"/>
-        </w:rPr>
-        <w:t xml:space="preserve">[atualizações] </w:t>
-      </w:r>
-      <w:r>
-        <w:t>vai fazer criar um histórico d</w:t>
-      </w:r>
-      <w:r>
-        <w:t>os valores dos campos abaixo em relação a uma data específica: Nesta tabela os dados terão origens diferentes como vou informar:</w:t>
-      </w:r>
-    </w:p>
-    <w:p>
-      <w:r>
-        <w:t xml:space="preserve">Os </w:t>
-      </w:r>
-      <w:r>
-        <w:t xml:space="preserve">valores </w:t>
-      </w:r>
-      <w:r>
-        <w:t>que vem da tabela original:</w:t>
-      </w:r>
-    </w:p>
-    <w:p>
-      <w:r>
-        <w:rPr>
-          <w:color w:val="4472C4" w:themeColor="accent1"/>
-        </w:rPr>
-        <w:lastRenderedPageBreak/>
+      <w:r>
+        <w:rPr>
+          <w:color w:val="7030A0"/>
+        </w:rPr>
+        <w:t xml:space="preserve"> = (</w:t>
+      </w:r>
+      <w:r>
+        <w:rPr>
+          <w:color w:val="4472C4" w:themeColor="accent1"/>
+        </w:rPr>
+        <w:t>[valor-venda]</w:t>
+      </w:r>
+      <w:r>
+        <w:rPr>
+          <w:color w:val="7030A0"/>
+        </w:rPr>
+        <w:t xml:space="preserve"> * </w:t>
+      </w:r>
+      <w:r>
+        <w:rPr>
+          <w:color w:val="70AD47" w:themeColor="accent6"/>
+        </w:rPr>
+        <w:t>[percentual-</w:t>
+      </w:r>
+      <w:proofErr w:type="spellStart"/>
+      <w:r>
+        <w:rPr>
+          <w:color w:val="70AD47" w:themeColor="accent6"/>
+        </w:rPr>
+        <w:t>prestacao</w:t>
+      </w:r>
+      <w:proofErr w:type="spellEnd"/>
+      <w:r>
+        <w:rPr>
+          <w:color w:val="70AD47" w:themeColor="accent6"/>
+        </w:rPr>
+        <w:t>-financiamento]</w:t>
+      </w:r>
+      <w:r>
+        <w:rPr>
+          <w:color w:val="7030A0"/>
+        </w:rPr>
+        <w:t>)</w:t>
+      </w:r>
+    </w:p>
+    <w:p>
+      <w:pPr>
+        <w:rPr>
+          <w:b/>
+          <w:bCs/>
+          <w:color w:val="7B7B7B" w:themeColor="accent3" w:themeShade="BF"/>
+        </w:rPr>
+      </w:pPr>
+      <w:r>
+        <w:rPr>
+          <w:color w:val="4472C4" w:themeColor="accent1"/>
+        </w:rPr>
+        <w:t xml:space="preserve">Se </w:t>
+      </w:r>
+      <w:r>
+        <w:rPr>
+          <w:b/>
+          <w:bCs/>
+          <w:color w:val="7B7B7B" w:themeColor="accent3" w:themeShade="BF"/>
+        </w:rPr>
+        <w:t>[financiamento-status]</w:t>
+      </w:r>
+      <w:r>
+        <w:rPr>
+          <w:color w:val="4472C4" w:themeColor="accent1"/>
+        </w:rPr>
+        <w:t xml:space="preserve"> = NÃO</w:t>
+      </w:r>
+    </w:p>
+    <w:p>
+      <w:pPr>
+        <w:rPr>
+          <w:color w:val="7030A0"/>
+        </w:rPr>
+      </w:pPr>
+      <w:r>
+        <w:rPr>
+          <w:color w:val="7B7B7B" w:themeColor="accent3" w:themeShade="BF"/>
+        </w:rPr>
+        <w:t>[financiamento-valor-</w:t>
+      </w:r>
+      <w:proofErr w:type="spellStart"/>
+      <w:r>
+        <w:rPr>
+          <w:color w:val="7B7B7B" w:themeColor="accent3" w:themeShade="BF"/>
+        </w:rPr>
+        <w:t>minimo</w:t>
+      </w:r>
+      <w:proofErr w:type="spellEnd"/>
+      <w:r>
+        <w:rPr>
+          <w:color w:val="7B7B7B" w:themeColor="accent3" w:themeShade="BF"/>
+        </w:rPr>
+        <w:t>]</w:t>
+      </w:r>
+      <w:r>
+        <w:rPr>
+          <w:color w:val="7030A0"/>
+        </w:rPr>
+        <w:t xml:space="preserve"> = [</w:t>
+      </w:r>
+      <w:r>
+        <w:rPr>
+          <w:color w:val="4472C4" w:themeColor="accent1"/>
+        </w:rPr>
+        <w:t>“-----“</w:t>
+      </w:r>
+      <w:r>
+        <w:rPr>
+          <w:color w:val="7030A0"/>
+        </w:rPr>
+        <w:t>]</w:t>
+      </w:r>
+    </w:p>
+    <w:p>
+      <w:pPr>
+        <w:rPr>
+          <w:color w:val="7030A0"/>
+        </w:rPr>
+      </w:pPr>
+      <w:r>
+        <w:rPr>
+          <w:color w:val="7B7B7B" w:themeColor="accent3" w:themeShade="BF"/>
+        </w:rPr>
         <w:t>[</w:t>
       </w:r>
       <w:r>
         <w:rPr>
-          <w:color w:val="4472C4" w:themeColor="accent1"/>
-        </w:rPr>
-        <w:t>modalidade</w:t>
-      </w:r>
-      <w:r>
-        <w:rPr>
-          <w:color w:val="4472C4" w:themeColor="accent1"/>
+          <w:color w:val="7B7B7B" w:themeColor="accent3" w:themeShade="BF"/>
+        </w:rPr>
+        <w:t>financiamento-</w:t>
+      </w:r>
+      <w:proofErr w:type="spellStart"/>
+      <w:r>
+        <w:rPr>
+          <w:color w:val="7B7B7B" w:themeColor="accent3" w:themeShade="BF"/>
+        </w:rPr>
+        <w:t>prestacao</w:t>
+      </w:r>
+      <w:proofErr w:type="spellEnd"/>
+      <w:r>
+        <w:rPr>
+          <w:color w:val="7B7B7B" w:themeColor="accent3" w:themeShade="BF"/>
         </w:rPr>
         <w:t>]</w:t>
       </w:r>
       <w:r>
-        <w:t xml:space="preserve">, </w:t>
-      </w:r>
-      <w:r>
-        <w:rPr>
-          <w:color w:val="4472C4" w:themeColor="accent1"/>
-        </w:rPr>
-        <w:t>[data]</w:t>
-      </w:r>
-      <w:r>
-        <w:rPr>
-          <w:color w:val="4472C4" w:themeColor="accent1"/>
-        </w:rPr>
-        <w:t xml:space="preserve">, </w:t>
-      </w:r>
-      <w:r>
-        <w:rPr>
-          <w:color w:val="4472C4" w:themeColor="accent1"/>
-        </w:rPr>
-        <w:t>[valor-venda]</w:t>
-      </w:r>
-      <w:r>
-        <w:rPr>
-          <w:color w:val="4472C4" w:themeColor="accent1"/>
-        </w:rPr>
-        <w:t xml:space="preserve">, </w:t>
-      </w:r>
-      <w:r>
-        <w:rPr>
-          <w:color w:val="4472C4" w:themeColor="accent1"/>
-        </w:rPr>
-        <w:t>[desconto-percentual]</w:t>
-      </w:r>
-      <w:r>
-        <w:rPr>
-          <w:color w:val="4472C4" w:themeColor="accent1"/>
-        </w:rPr>
-        <w:t xml:space="preserve">, </w:t>
-      </w:r>
-      <w:r>
-        <w:rPr>
-          <w:color w:val="4472C4" w:themeColor="accent1"/>
-        </w:rPr>
-        <w:t>[valor-</w:t>
-      </w:r>
-      <w:proofErr w:type="spellStart"/>
-      <w:r>
-        <w:rPr>
-          <w:color w:val="4472C4" w:themeColor="accent1"/>
-        </w:rPr>
-        <w:t>avaliacao</w:t>
-      </w:r>
-      <w:proofErr w:type="spellEnd"/>
-      <w:r>
-        <w:rPr>
-          <w:color w:val="4472C4" w:themeColor="accent1"/>
+        <w:rPr>
+          <w:color w:val="7030A0"/>
+        </w:rPr>
+        <w:t xml:space="preserve"> = [</w:t>
+      </w:r>
+      <w:r>
+        <w:rPr>
+          <w:color w:val="4472C4" w:themeColor="accent1"/>
+        </w:rPr>
+        <w:t>“-----“</w:t>
+      </w:r>
+      <w:r>
+        <w:rPr>
+          <w:color w:val="7030A0"/>
         </w:rPr>
         <w:t>]</w:t>
       </w:r>
-      <w:r>
-        <w:rPr>
-          <w:color w:val="4472C4" w:themeColor="accent1"/>
-        </w:rPr>
-        <w:t xml:space="preserve"> </w:t>
-      </w:r>
-      <w:r>
-        <w:rPr>
-          <w:color w:val="4472C4" w:themeColor="accent1"/>
-        </w:rPr>
-        <w:t>[</w:t>
-      </w:r>
-      <w:r>
-        <w:rPr>
-          <w:color w:val="4472C4" w:themeColor="accent1"/>
-        </w:rPr>
-        <w:t>financiamento</w:t>
-      </w:r>
-      <w:r>
-        <w:rPr>
-          <w:color w:val="4472C4" w:themeColor="accent1"/>
-        </w:rPr>
-        <w:t>]</w:t>
-      </w:r>
-      <w:r>
-        <w:rPr>
-          <w:color w:val="4472C4" w:themeColor="accent1"/>
-        </w:rPr>
-        <w:t xml:space="preserve">, </w:t>
-      </w:r>
-      <w:r>
-        <w:rPr>
-          <w:color w:val="4472C4" w:themeColor="accent1"/>
-        </w:rPr>
-        <w:t>[desconto-percentual]</w:t>
-      </w:r>
-    </w:p>
-    <w:p>
-      <w:r>
-        <w:t xml:space="preserve">Os valores que </w:t>
-      </w:r>
-      <w:r>
-        <w:t>precisam ser calculados</w:t>
-      </w:r>
-      <w:r>
-        <w:t>:</w:t>
-      </w:r>
     </w:p>
     <w:p>
       <w:pPr>
@@ -1379,441 +1739,10 @@
           <w:color w:val="7030A0"/>
         </w:rPr>
       </w:pPr>
-      <w:r>
-        <w:rPr>
-          <w:b/>
-          <w:bCs/>
-          <w:color w:val="7B7B7B" w:themeColor="accent3" w:themeShade="BF"/>
-        </w:rPr>
-        <w:t>[</w:t>
-      </w:r>
-      <w:r>
-        <w:rPr>
-          <w:b/>
-          <w:bCs/>
-          <w:color w:val="7B7B7B" w:themeColor="accent3" w:themeShade="BF"/>
-        </w:rPr>
-        <w:t>desconto-real</w:t>
-      </w:r>
-      <w:r>
-        <w:rPr>
-          <w:b/>
-          <w:bCs/>
-          <w:color w:val="7B7B7B" w:themeColor="accent3" w:themeShade="BF"/>
-        </w:rPr>
-        <w:t>]</w:t>
-      </w:r>
-      <w:r>
-        <w:t xml:space="preserve"> </w:t>
-      </w:r>
-      <w:r>
-        <w:rPr>
-          <w:color w:val="7030A0"/>
-        </w:rPr>
-        <w:t>= (</w:t>
-      </w:r>
-      <w:r>
-        <w:rPr>
-          <w:color w:val="4472C4" w:themeColor="accent1"/>
-        </w:rPr>
-        <w:t>[valor-venda]</w:t>
-      </w:r>
-      <w:r>
-        <w:rPr>
-          <w:color w:val="7030A0"/>
-        </w:rPr>
-        <w:t xml:space="preserve"> </w:t>
-      </w:r>
-      <w:r>
-        <w:rPr>
-          <w:color w:val="7030A0"/>
-        </w:rPr>
-        <w:t xml:space="preserve">- </w:t>
-      </w:r>
-      <w:r>
-        <w:rPr>
-          <w:color w:val="4472C4" w:themeColor="accent1"/>
-        </w:rPr>
-        <w:t>[valor-venda]</w:t>
-      </w:r>
-      <w:r>
-        <w:rPr>
-          <w:color w:val="7030A0"/>
-        </w:rPr>
-        <w:t>)</w:t>
-      </w:r>
-      <w:r>
-        <w:rPr>
-          <w:color w:val="7030A0"/>
-        </w:rPr>
-        <w:t xml:space="preserve"> </w:t>
-      </w:r>
-      <w:r>
-        <w:t>grava</w:t>
-      </w:r>
-      <w:r>
-        <w:t xml:space="preserve">ndo o </w:t>
-      </w:r>
-      <w:r>
-        <w:t>resultado em R$</w:t>
-      </w:r>
-    </w:p>
-    <w:p>
-      <w:pPr>
-        <w:rPr>
-          <w:color w:val="4472C4" w:themeColor="accent1"/>
-        </w:rPr>
-      </w:pPr>
-    </w:p>
-    <w:p>
-      <w:pPr>
-        <w:rPr>
-          <w:b/>
-          <w:bCs/>
-          <w:color w:val="7B7B7B" w:themeColor="accent3" w:themeShade="BF"/>
-        </w:rPr>
-      </w:pPr>
-      <w:r>
-        <w:rPr>
-          <w:color w:val="4472C4" w:themeColor="accent1"/>
-        </w:rPr>
-        <w:t xml:space="preserve">Se </w:t>
-      </w:r>
-      <w:r>
-        <w:rPr>
-          <w:b/>
-          <w:bCs/>
-          <w:color w:val="7B7B7B" w:themeColor="accent3" w:themeShade="BF"/>
-        </w:rPr>
-        <w:t>[financiamento-status]</w:t>
-      </w:r>
-      <w:r>
-        <w:rPr>
-          <w:color w:val="4472C4" w:themeColor="accent1"/>
-        </w:rPr>
-        <w:t xml:space="preserve"> = SIM</w:t>
-      </w:r>
-    </w:p>
-    <w:p>
-      <w:pPr>
-        <w:rPr>
-          <w:color w:val="7030A0"/>
-        </w:rPr>
-      </w:pPr>
-      <w:r>
-        <w:rPr>
-          <w:color w:val="7B7B7B" w:themeColor="accent3" w:themeShade="BF"/>
-        </w:rPr>
-        <w:t>[</w:t>
-      </w:r>
-      <w:r>
-        <w:rPr>
-          <w:color w:val="7B7B7B" w:themeColor="accent3" w:themeShade="BF"/>
-        </w:rPr>
-        <w:t>financiamento-valor</w:t>
-      </w:r>
-      <w:r>
-        <w:rPr>
-          <w:color w:val="7B7B7B" w:themeColor="accent3" w:themeShade="BF"/>
-        </w:rPr>
-        <w:t>-</w:t>
-      </w:r>
-      <w:proofErr w:type="spellStart"/>
-      <w:r>
-        <w:rPr>
-          <w:color w:val="7B7B7B" w:themeColor="accent3" w:themeShade="BF"/>
-        </w:rPr>
-        <w:t>minimo</w:t>
-      </w:r>
-      <w:proofErr w:type="spellEnd"/>
-      <w:r>
-        <w:rPr>
-          <w:color w:val="7B7B7B" w:themeColor="accent3" w:themeShade="BF"/>
-        </w:rPr>
-        <w:t>]</w:t>
-      </w:r>
-      <w:r>
-        <w:rPr>
-          <w:color w:val="7030A0"/>
-        </w:rPr>
-        <w:t xml:space="preserve"> = </w:t>
-      </w:r>
-      <w:r>
-        <w:rPr>
-          <w:color w:val="7030A0"/>
-        </w:rPr>
-        <w:t>(</w:t>
-      </w:r>
-      <w:r>
-        <w:rPr>
-          <w:color w:val="4472C4" w:themeColor="accent1"/>
-        </w:rPr>
-        <w:t>[valor-venda]</w:t>
-      </w:r>
-      <w:r>
-        <w:rPr>
-          <w:color w:val="7030A0"/>
-        </w:rPr>
-        <w:t xml:space="preserve"> * </w:t>
-      </w:r>
-      <w:r>
-        <w:rPr>
-          <w:color w:val="70AD47" w:themeColor="accent6"/>
-        </w:rPr>
-        <w:t>[percentual-entrada-financiamento</w:t>
-      </w:r>
-      <w:r>
-        <w:rPr>
-          <w:color w:val="70AD47" w:themeColor="accent6"/>
-        </w:rPr>
-        <w:t>]</w:t>
-      </w:r>
-      <w:r>
-        <w:rPr>
-          <w:color w:val="7030A0"/>
-        </w:rPr>
-        <w:t>)</w:t>
-      </w:r>
-    </w:p>
-    <w:p>
-      <w:pPr>
-        <w:rPr>
-          <w:color w:val="7030A0"/>
-        </w:rPr>
-      </w:pPr>
-      <w:r>
-        <w:rPr>
-          <w:color w:val="7B7B7B" w:themeColor="accent3" w:themeShade="BF"/>
-        </w:rPr>
-        <w:t>[</w:t>
-      </w:r>
-      <w:r>
-        <w:rPr>
-          <w:color w:val="7B7B7B" w:themeColor="accent3" w:themeShade="BF"/>
-        </w:rPr>
-        <w:t>financiamento-</w:t>
-      </w:r>
-      <w:proofErr w:type="spellStart"/>
-      <w:r>
-        <w:rPr>
-          <w:color w:val="7B7B7B" w:themeColor="accent3" w:themeShade="BF"/>
-        </w:rPr>
-        <w:t>prestacao</w:t>
-      </w:r>
-      <w:proofErr w:type="spellEnd"/>
-      <w:r>
-        <w:rPr>
-          <w:color w:val="7B7B7B" w:themeColor="accent3" w:themeShade="BF"/>
-        </w:rPr>
-        <w:t>]</w:t>
-      </w:r>
-      <w:r>
-        <w:rPr>
-          <w:color w:val="7030A0"/>
-        </w:rPr>
-        <w:t xml:space="preserve"> =</w:t>
-      </w:r>
-      <w:r>
-        <w:rPr>
-          <w:color w:val="7030A0"/>
-        </w:rPr>
-        <w:t xml:space="preserve"> (</w:t>
-      </w:r>
-      <w:r>
-        <w:rPr>
-          <w:color w:val="4472C4" w:themeColor="accent1"/>
-        </w:rPr>
-        <w:t>[valor-venda]</w:t>
-      </w:r>
-      <w:r>
-        <w:rPr>
-          <w:color w:val="7030A0"/>
-        </w:rPr>
-        <w:t xml:space="preserve"> * </w:t>
-      </w:r>
-      <w:r>
-        <w:rPr>
-          <w:color w:val="70AD47" w:themeColor="accent6"/>
-        </w:rPr>
-        <w:t>[percentual-</w:t>
-      </w:r>
-      <w:proofErr w:type="spellStart"/>
-      <w:r>
-        <w:rPr>
-          <w:color w:val="70AD47" w:themeColor="accent6"/>
-        </w:rPr>
-        <w:t>prestacao</w:t>
-      </w:r>
-      <w:proofErr w:type="spellEnd"/>
-      <w:r>
-        <w:rPr>
-          <w:color w:val="70AD47" w:themeColor="accent6"/>
-        </w:rPr>
-        <w:t>-financiamento]</w:t>
-      </w:r>
-      <w:r>
-        <w:rPr>
-          <w:color w:val="7030A0"/>
-        </w:rPr>
-        <w:t>)</w:t>
-      </w:r>
-    </w:p>
-    <w:p>
-      <w:pPr>
-        <w:rPr>
-          <w:b/>
-          <w:bCs/>
-          <w:color w:val="7B7B7B" w:themeColor="accent3" w:themeShade="BF"/>
-        </w:rPr>
-      </w:pPr>
-      <w:r>
-        <w:rPr>
-          <w:color w:val="4472C4" w:themeColor="accent1"/>
-        </w:rPr>
-        <w:t xml:space="preserve">Se </w:t>
-      </w:r>
-      <w:r>
-        <w:rPr>
-          <w:b/>
-          <w:bCs/>
-          <w:color w:val="7B7B7B" w:themeColor="accent3" w:themeShade="BF"/>
-        </w:rPr>
-        <w:t>[financiamento-status]</w:t>
-      </w:r>
-      <w:r>
-        <w:rPr>
-          <w:color w:val="4472C4" w:themeColor="accent1"/>
-        </w:rPr>
-        <w:t xml:space="preserve"> = </w:t>
-      </w:r>
-      <w:r>
-        <w:rPr>
-          <w:color w:val="4472C4" w:themeColor="accent1"/>
-        </w:rPr>
-        <w:t>NÃO</w:t>
-      </w:r>
-    </w:p>
-    <w:p>
-      <w:pPr>
-        <w:rPr>
-          <w:color w:val="7030A0"/>
-        </w:rPr>
-      </w:pPr>
-      <w:r>
-        <w:rPr>
-          <w:color w:val="7B7B7B" w:themeColor="accent3" w:themeShade="BF"/>
-        </w:rPr>
-        <w:t>[financiamento-valor-</w:t>
-      </w:r>
-      <w:proofErr w:type="spellStart"/>
-      <w:r>
-        <w:rPr>
-          <w:color w:val="7B7B7B" w:themeColor="accent3" w:themeShade="BF"/>
-        </w:rPr>
-        <w:t>minimo</w:t>
-      </w:r>
-      <w:proofErr w:type="spellEnd"/>
-      <w:r>
-        <w:rPr>
-          <w:color w:val="7B7B7B" w:themeColor="accent3" w:themeShade="BF"/>
-        </w:rPr>
-        <w:t>]</w:t>
-      </w:r>
-      <w:r>
-        <w:rPr>
-          <w:color w:val="7030A0"/>
-        </w:rPr>
-        <w:t xml:space="preserve"> = </w:t>
-      </w:r>
-      <w:r>
-        <w:rPr>
-          <w:color w:val="7030A0"/>
-        </w:rPr>
-        <w:t>[</w:t>
-      </w:r>
-      <w:r>
-        <w:rPr>
-          <w:color w:val="4472C4" w:themeColor="accent1"/>
-        </w:rPr>
-        <w:t>“-----“</w:t>
-      </w:r>
-      <w:r>
-        <w:rPr>
-          <w:color w:val="7030A0"/>
-        </w:rPr>
-        <w:t>]</w:t>
-      </w:r>
-    </w:p>
-    <w:p>
-      <w:pPr>
-        <w:rPr>
-          <w:color w:val="7030A0"/>
-        </w:rPr>
-      </w:pPr>
-      <w:r>
-        <w:rPr>
-          <w:color w:val="7B7B7B" w:themeColor="accent3" w:themeShade="BF"/>
-        </w:rPr>
-        <w:t>[</w:t>
-      </w:r>
-      <w:r>
-        <w:rPr>
-          <w:color w:val="7B7B7B" w:themeColor="accent3" w:themeShade="BF"/>
-        </w:rPr>
-        <w:t>financiamento-</w:t>
-      </w:r>
-      <w:proofErr w:type="spellStart"/>
-      <w:r>
-        <w:rPr>
-          <w:color w:val="7B7B7B" w:themeColor="accent3" w:themeShade="BF"/>
-        </w:rPr>
-        <w:t>prestacao</w:t>
-      </w:r>
-      <w:proofErr w:type="spellEnd"/>
-      <w:r>
-        <w:rPr>
-          <w:color w:val="7B7B7B" w:themeColor="accent3" w:themeShade="BF"/>
-        </w:rPr>
-        <w:t>]</w:t>
-      </w:r>
-      <w:r>
-        <w:rPr>
-          <w:color w:val="7030A0"/>
-        </w:rPr>
-        <w:t xml:space="preserve"> = </w:t>
-      </w:r>
-      <w:r>
-        <w:rPr>
-          <w:color w:val="7030A0"/>
-        </w:rPr>
-        <w:t>[</w:t>
-      </w:r>
-      <w:r>
-        <w:rPr>
-          <w:color w:val="4472C4" w:themeColor="accent1"/>
-        </w:rPr>
-        <w:t>“-----“</w:t>
-      </w:r>
-      <w:r>
-        <w:rPr>
-          <w:color w:val="7030A0"/>
-        </w:rPr>
-        <w:t>]</w:t>
-      </w:r>
-    </w:p>
-    <w:p>
-      <w:pPr>
-        <w:rPr>
-          <w:color w:val="7030A0"/>
-        </w:rPr>
-      </w:pPr>
-    </w:p>
-    <w:p>
-      <w:r>
-        <w:t xml:space="preserve">Os valores que </w:t>
-      </w:r>
-      <w:r>
-        <w:t xml:space="preserve">que vamos salvar </w:t>
+    </w:p>
+    <w:p>
+      <w:r>
+        <w:t xml:space="preserve">Os valores que que vamos salvar </w:t>
       </w:r>
       <w:r>
         <w:t>de acordo com outra tabela</w:t>
@@ -2360,6 +2289,7 @@
           <w:b/>
           <w:bCs/>
         </w:rPr>
+        <w:lastRenderedPageBreak/>
         <w:t>Unicode:</w:t>
       </w:r>
       <w:r>
@@ -2515,7 +2445,6 @@
     </w:p>
     <w:p>
       <w:r>
-        <w:lastRenderedPageBreak/>
         <w:t xml:space="preserve">Se precisar usar direto no código HTML (como nas landing </w:t>
       </w:r>
       <w:proofErr w:type="spellStart"/>
@@ -2589,13 +2518,7 @@
         </w:rPr>
       </w:pPr>
       <w:r>
-        <w:t>Passo 0</w:t>
-      </w:r>
-      <w:r>
-        <w:t>4</w:t>
-      </w:r>
-      <w:r>
-        <w:t xml:space="preserve"> – </w:t>
+        <w:t xml:space="preserve">Passo 04 – </w:t>
       </w:r>
       <w:r>
         <w:t>CRIAR</w:t>
@@ -2734,7 +2657,15 @@
         <w:t>]</w:t>
       </w:r>
       <w:r>
-        <w:t xml:space="preserve">: Um imóvel só pode ter um CEP </w:t>
+        <w:t xml:space="preserve">: Um imóvel só pode ter um </w:t>
+      </w:r>
+      <w:proofErr w:type="gramStart"/>
+      <w:r>
+        <w:t>CEP</w:t>
+      </w:r>
+      <w:proofErr w:type="gramEnd"/>
+      <w:r>
+        <w:t xml:space="preserve"> </w:t>
       </w:r>
       <w:r>
         <w:t>m</w:t>
@@ -2781,10 +2712,7 @@
     <w:p/>
     <w:p>
       <w:r>
-        <w:t>cep-id</w:t>
-      </w:r>
-      <w:r>
-        <w:t xml:space="preserve"> (chave primária)</w:t>
+        <w:t>cep-id (chave primária)</w:t>
       </w:r>
       <w:r>
         <w:t xml:space="preserve">, </w:t>
@@ -3163,7 +3091,6 @@
           <w:b/>
           <w:bCs/>
         </w:rPr>
-        <w:lastRenderedPageBreak/>
         <w:t>Passo 0</w:t>
       </w:r>
       <w:r>
@@ -3267,21 +3194,7 @@
           <w:b/>
           <w:bCs/>
         </w:rPr>
-        <w:t>[</w:t>
-      </w:r>
-      <w:r>
-        <w:rPr>
-          <w:b/>
-          <w:bCs/>
-        </w:rPr>
-        <w:t>Data de geração</w:t>
-      </w:r>
-      <w:r>
-        <w:rPr>
-          <w:b/>
-          <w:bCs/>
-        </w:rPr>
-        <w:t>]</w:t>
+        <w:t>[Data de geração]</w:t>
       </w:r>
       <w:r>
         <w:t xml:space="preserve"> passa a ser entendida como data de atualização. Deverá ser criada uma tabela de referencia entre o [imóvel] e a atualização que ele está </w:t>
@@ -3527,7 +3440,15 @@
     </w:p>
     <w:p>
       <w:r>
-        <w:t>ESTRADA VEREADOR BENEDITO ADELINO, N. 3221, Apto 01, BL 05, PRIMEIRO DISTRITO</w:t>
+        <w:t xml:space="preserve">ESTRADA VEREADOR BENEDITO ADELINO, N. 3221, </w:t>
+      </w:r>
+      <w:proofErr w:type="gramStart"/>
+      <w:r>
+        <w:t>Apto</w:t>
+      </w:r>
+      <w:proofErr w:type="gramEnd"/>
+      <w:r>
+        <w:t xml:space="preserve"> 01, BL 05, PRIMEIRO DISTRITO</w:t>
       </w:r>
     </w:p>
     <w:p>
@@ -3615,7 +3536,15 @@
     <w:p/>
     <w:p>
       <w:r>
-        <w:t>Casa, 0.00 de área total, 356.53 de área privativa, 1200.00 de área do terreno, 4 vaga(s) de garagem</w:t>
+        <w:t xml:space="preserve">Casa, 0.00 de área total, 356.53 de área privativa, 1200.00 de área do terreno, </w:t>
+      </w:r>
+      <w:proofErr w:type="gramStart"/>
+      <w:r>
+        <w:t>4 vaga</w:t>
+      </w:r>
+      <w:proofErr w:type="gramEnd"/>
+      <w:r>
+        <w:t>(s) de garagem</w:t>
       </w:r>
       <w:r>
         <w:t>, varanda, terraço, piscina</w:t>
@@ -3629,7 +3558,15 @@
     </w:p>
     <w:p>
       <w:r>
-        <w:t xml:space="preserve">Apartamento, 93.61 de área total, 93.61 de área privativa, 0.00 de área do terreno,  2 </w:t>
+        <w:t xml:space="preserve">Apartamento, 93.61 de área total, 93.61 de área privativa, 0.00 de área do </w:t>
+      </w:r>
+      <w:proofErr w:type="gramStart"/>
+      <w:r>
+        <w:t>terreno,  2</w:t>
+      </w:r>
+      <w:proofErr w:type="gramEnd"/>
+      <w:r>
+        <w:t xml:space="preserve"> </w:t>
       </w:r>
       <w:proofErr w:type="spellStart"/>
       <w:r>
@@ -3655,7 +3592,16 @@
     </w:p>
     <w:p>
       <w:r>
-        <w:t xml:space="preserve">Prédio, 79.60 de área total, 79.60 de área privativa, 250.00 de área do terreno,  3 </w:t>
+        <w:lastRenderedPageBreak/>
+        <w:t xml:space="preserve">Prédio, 79.60 de área total, 79.60 de área privativa, 250.00 de área do </w:t>
+      </w:r>
+      <w:proofErr w:type="gramStart"/>
+      <w:r>
+        <w:t>terreno,  3</w:t>
+      </w:r>
+      <w:proofErr w:type="gramEnd"/>
+      <w:r>
+        <w:t xml:space="preserve"> </w:t>
       </w:r>
       <w:proofErr w:type="spellStart"/>
       <w:r>
@@ -3698,6 +3644,686 @@
         <w:t>Analisando os exemplos conseguimos extrair os seguintes campos</w:t>
       </w:r>
     </w:p>
+    <w:p>
+      <w:r>
+        <w:rPr>
+          <w:b/>
+          <w:bCs/>
+        </w:rPr>
+        <w:t>[</w:t>
+      </w:r>
+      <w:r>
+        <w:rPr>
+          <w:b/>
+          <w:bCs/>
+        </w:rPr>
+        <w:t>Tipo do Imóvel</w:t>
+      </w:r>
+      <w:r>
+        <w:rPr>
+          <w:b/>
+          <w:bCs/>
+        </w:rPr>
+        <w:t>]</w:t>
+      </w:r>
+      <w:r>
+        <w:t>: (casa – apartamento – terreno</w:t>
+      </w:r>
+      <w:r>
+        <w:t xml:space="preserve"> </w:t>
+      </w:r>
+      <w:r>
+        <w:t>–</w:t>
+      </w:r>
+      <w:r>
+        <w:t xml:space="preserve"> </w:t>
+      </w:r>
+      <w:r>
+        <w:t>prédio – loja – sala - galpão</w:t>
+      </w:r>
+      <w:r>
+        <w:t>)</w:t>
+      </w:r>
+    </w:p>
+    <w:p>
+      <w:pPr>
+        <w:rPr>
+          <w:b/>
+          <w:bCs/>
+        </w:rPr>
+      </w:pPr>
+      <w:r>
+        <w:rPr>
+          <w:b/>
+          <w:bCs/>
+        </w:rPr>
+        <w:t>[área-</w:t>
+      </w:r>
+      <w:r>
+        <w:rPr>
+          <w:b/>
+          <w:bCs/>
+        </w:rPr>
+        <w:t>total</w:t>
+      </w:r>
+      <w:proofErr w:type="gramStart"/>
+      <w:r>
+        <w:rPr>
+          <w:b/>
+          <w:bCs/>
+        </w:rPr>
+        <w:t xml:space="preserve">] </w:t>
+      </w:r>
+      <w:r>
+        <w:rPr>
+          <w:b/>
+          <w:bCs/>
+        </w:rPr>
+        <w:t>;</w:t>
+      </w:r>
+      <w:proofErr w:type="gramEnd"/>
+      <w:r>
+        <w:rPr>
+          <w:b/>
+          <w:bCs/>
+        </w:rPr>
+        <w:t xml:space="preserve"> </w:t>
+      </w:r>
+      <w:r>
+        <w:rPr>
+          <w:b/>
+          <w:bCs/>
+        </w:rPr>
+        <w:t>[área-</w:t>
+      </w:r>
+      <w:r>
+        <w:rPr>
+          <w:b/>
+          <w:bCs/>
+        </w:rPr>
+        <w:t>privativa</w:t>
+      </w:r>
+      <w:r>
+        <w:rPr>
+          <w:b/>
+          <w:bCs/>
+        </w:rPr>
+        <w:t xml:space="preserve">] </w:t>
+      </w:r>
+      <w:r>
+        <w:rPr>
+          <w:b/>
+          <w:bCs/>
+        </w:rPr>
+        <w:t xml:space="preserve">; </w:t>
+      </w:r>
+      <w:r>
+        <w:rPr>
+          <w:b/>
+          <w:bCs/>
+        </w:rPr>
+        <w:t>[</w:t>
+      </w:r>
+      <w:proofErr w:type="spellStart"/>
+      <w:r>
+        <w:rPr>
+          <w:b/>
+          <w:bCs/>
+        </w:rPr>
+        <w:t>area</w:t>
+      </w:r>
+      <w:proofErr w:type="spellEnd"/>
+      <w:r>
+        <w:rPr>
+          <w:b/>
+          <w:bCs/>
+        </w:rPr>
+        <w:t>-</w:t>
+      </w:r>
+      <w:r>
+        <w:rPr>
+          <w:b/>
+          <w:bCs/>
+        </w:rPr>
+        <w:t>terreno</w:t>
+      </w:r>
+      <w:r>
+        <w:rPr>
+          <w:b/>
+          <w:bCs/>
+        </w:rPr>
+        <w:t xml:space="preserve">] </w:t>
+      </w:r>
+      <w:r>
+        <w:rPr>
+          <w:b/>
+          <w:bCs/>
+        </w:rPr>
+        <w:t xml:space="preserve">; </w:t>
+      </w:r>
+      <w:r>
+        <w:rPr>
+          <w:b/>
+          <w:bCs/>
+        </w:rPr>
+        <w:t>[</w:t>
+      </w:r>
+      <w:r>
+        <w:rPr>
+          <w:b/>
+          <w:bCs/>
+        </w:rPr>
+        <w:t>quartos</w:t>
+      </w:r>
+      <w:r>
+        <w:rPr>
+          <w:b/>
+          <w:bCs/>
+        </w:rPr>
+        <w:t>]</w:t>
+      </w:r>
+      <w:r>
+        <w:rPr>
+          <w:b/>
+          <w:bCs/>
+        </w:rPr>
+        <w:t xml:space="preserve">; </w:t>
+      </w:r>
+      <w:r>
+        <w:rPr>
+          <w:b/>
+          <w:bCs/>
+        </w:rPr>
+        <w:t xml:space="preserve">[banheiros] </w:t>
+      </w:r>
+      <w:proofErr w:type="spellStart"/>
+      <w:r>
+        <w:rPr>
+          <w:b/>
+          <w:bCs/>
+        </w:rPr>
+        <w:t>wc</w:t>
+      </w:r>
+      <w:proofErr w:type="spellEnd"/>
+      <w:r>
+        <w:rPr>
+          <w:b/>
+          <w:bCs/>
+        </w:rPr>
+        <w:t xml:space="preserve"> </w:t>
+      </w:r>
+      <w:r>
+        <w:rPr>
+          <w:b/>
+          <w:bCs/>
+        </w:rPr>
+        <w:t xml:space="preserve">= banheiros; </w:t>
+      </w:r>
+      <w:r>
+        <w:rPr>
+          <w:b/>
+          <w:bCs/>
+        </w:rPr>
+        <w:t>[área-</w:t>
+      </w:r>
+      <w:r>
+        <w:rPr>
+          <w:b/>
+          <w:bCs/>
+        </w:rPr>
+        <w:t>serviço</w:t>
+      </w:r>
+      <w:r>
+        <w:rPr>
+          <w:b/>
+          <w:bCs/>
+        </w:rPr>
+        <w:t xml:space="preserve">] </w:t>
+      </w:r>
+      <w:r>
+        <w:rPr>
+          <w:b/>
+          <w:bCs/>
+        </w:rPr>
+        <w:t xml:space="preserve">; </w:t>
+      </w:r>
+      <w:r>
+        <w:rPr>
+          <w:b/>
+          <w:bCs/>
+        </w:rPr>
+        <w:t>[</w:t>
+      </w:r>
+      <w:r>
+        <w:rPr>
+          <w:b/>
+          <w:bCs/>
+        </w:rPr>
+        <w:t>sala</w:t>
+      </w:r>
+      <w:r>
+        <w:rPr>
+          <w:b/>
+          <w:bCs/>
+        </w:rPr>
+        <w:t xml:space="preserve">] </w:t>
+      </w:r>
+      <w:r>
+        <w:rPr>
+          <w:b/>
+          <w:bCs/>
+        </w:rPr>
+        <w:t xml:space="preserve">; </w:t>
+      </w:r>
+      <w:r>
+        <w:rPr>
+          <w:b/>
+          <w:bCs/>
+        </w:rPr>
+        <w:t>[</w:t>
+      </w:r>
+      <w:r>
+        <w:rPr>
+          <w:b/>
+          <w:bCs/>
+        </w:rPr>
+        <w:t>cozinha</w:t>
+      </w:r>
+      <w:r>
+        <w:rPr>
+          <w:b/>
+          <w:bCs/>
+        </w:rPr>
+        <w:t xml:space="preserve">] </w:t>
+      </w:r>
+      <w:r>
+        <w:rPr>
+          <w:b/>
+          <w:bCs/>
+        </w:rPr>
+        <w:t xml:space="preserve">; </w:t>
+      </w:r>
+      <w:r>
+        <w:rPr>
+          <w:b/>
+          <w:bCs/>
+        </w:rPr>
+        <w:t>[</w:t>
+      </w:r>
+      <w:r>
+        <w:rPr>
+          <w:b/>
+          <w:bCs/>
+        </w:rPr>
+        <w:t>vagas</w:t>
+      </w:r>
+      <w:r>
+        <w:rPr>
+          <w:b/>
+          <w:bCs/>
+        </w:rPr>
+        <w:t>-</w:t>
+      </w:r>
+      <w:r>
+        <w:rPr>
+          <w:b/>
+          <w:bCs/>
+        </w:rPr>
+        <w:t>de</w:t>
+      </w:r>
+      <w:r>
+        <w:rPr>
+          <w:b/>
+          <w:bCs/>
+        </w:rPr>
+        <w:t>-</w:t>
+      </w:r>
+      <w:r>
+        <w:rPr>
+          <w:b/>
+          <w:bCs/>
+        </w:rPr>
+        <w:t>garagem</w:t>
+      </w:r>
+      <w:r>
+        <w:rPr>
+          <w:b/>
+          <w:bCs/>
+        </w:rPr>
+        <w:t>] ;</w:t>
+      </w:r>
+      <w:r>
+        <w:rPr>
+          <w:b/>
+          <w:bCs/>
+        </w:rPr>
+        <w:t xml:space="preserve"> </w:t>
+      </w:r>
+      <w:r>
+        <w:rPr>
+          <w:b/>
+          <w:bCs/>
+        </w:rPr>
+        <w:t>[</w:t>
+      </w:r>
+      <w:r>
+        <w:rPr>
+          <w:b/>
+          <w:bCs/>
+        </w:rPr>
+        <w:t>varanda</w:t>
+      </w:r>
+      <w:r>
+        <w:rPr>
+          <w:b/>
+          <w:bCs/>
+        </w:rPr>
+        <w:t>] ;</w:t>
+      </w:r>
+      <w:r>
+        <w:rPr>
+          <w:b/>
+          <w:bCs/>
+        </w:rPr>
+        <w:t xml:space="preserve"> </w:t>
+      </w:r>
+      <w:r>
+        <w:rPr>
+          <w:b/>
+          <w:bCs/>
+        </w:rPr>
+        <w:t>[</w:t>
+      </w:r>
+      <w:proofErr w:type="spellStart"/>
+      <w:r>
+        <w:rPr>
+          <w:b/>
+          <w:bCs/>
+        </w:rPr>
+        <w:t>terraco</w:t>
+      </w:r>
+      <w:proofErr w:type="spellEnd"/>
+      <w:r>
+        <w:rPr>
+          <w:b/>
+          <w:bCs/>
+        </w:rPr>
+        <w:t>] ; [</w:t>
+      </w:r>
+      <w:r>
+        <w:rPr>
+          <w:b/>
+          <w:bCs/>
+        </w:rPr>
+        <w:t>piscina</w:t>
+      </w:r>
+      <w:r>
+        <w:rPr>
+          <w:b/>
+          <w:bCs/>
+        </w:rPr>
+        <w:t xml:space="preserve">] ; [sauna] ; </w:t>
+      </w:r>
+      <w:r>
+        <w:rPr>
+          <w:b/>
+          <w:bCs/>
+        </w:rPr>
+        <w:t xml:space="preserve"> </w:t>
+      </w:r>
+      <w:r>
+        <w:rPr>
+          <w:b/>
+          <w:bCs/>
+        </w:rPr>
+        <w:t>[churrasqueira</w:t>
+      </w:r>
+      <w:r>
+        <w:rPr>
+          <w:b/>
+          <w:bCs/>
+        </w:rPr>
+        <w:t>]</w:t>
+      </w:r>
+    </w:p>
+    <w:p>
+      <w:r>
+        <w:t>Ainda temos alguns casos de erro de cadastro que precisamos tratar, segue exemplo:</w:t>
+      </w:r>
+    </w:p>
+    <w:p>
+      <w:r>
+        <w:t>Comercial, 0.00 de área total, 360.00 de área privativa, 360.00 de área do terreno.</w:t>
+      </w:r>
+    </w:p>
+    <w:p>
+      <w:r>
+        <w:t xml:space="preserve">O campo Comercial que está querendo se referir </w:t>
+      </w:r>
+      <w:proofErr w:type="spellStart"/>
+      <w:r>
+        <w:t>a</w:t>
+      </w:r>
+      <w:proofErr w:type="spellEnd"/>
+      <w:r>
+        <w:t xml:space="preserve"> tipo do imóvel na verdade é um terreno, “Comercial” é a natureza do imóvel, ou seja</w:t>
+      </w:r>
+      <w:r>
+        <w:t>,</w:t>
+      </w:r>
+      <w:r>
+        <w:t xml:space="preserve"> ele é feito para uso comercial assim como lojas e salas comerciais; da mesma forma que temos as casas e os apartamentos que são feitos para uso residencial. Como no geral o número de casas</w:t>
+      </w:r>
+      <w:r>
+        <w:t xml:space="preserve"> que podem ser de uso comercial é bem pequeno, vamos seguir o padrão de toda casa é residencial</w:t>
+      </w:r>
+    </w:p>
+    <w:p>
+      <w:r>
+        <w:t xml:space="preserve">Logo vamos criar mais um campo de informação </w:t>
+      </w:r>
+      <w:r>
+        <w:rPr>
+          <w:b/>
+          <w:bCs/>
+        </w:rPr>
+        <w:t>[Natureza do Imóvel]</w:t>
+      </w:r>
+    </w:p>
+    <w:p>
+      <w:r>
+        <w:br/>
+      </w:r>
+    </w:p>
+    <w:p>
+      <w:r>
+        <w:rPr>
+          <w:b/>
+          <w:bCs/>
+        </w:rPr>
+        <w:t>[</w:t>
+      </w:r>
+      <w:r>
+        <w:rPr>
+          <w:b/>
+          <w:bCs/>
+        </w:rPr>
+        <w:t>Link de acesso</w:t>
+      </w:r>
+      <w:r>
+        <w:rPr>
+          <w:b/>
+          <w:bCs/>
+        </w:rPr>
+        <w:t>]</w:t>
+      </w:r>
+      <w:r>
+        <w:t xml:space="preserve"> = </w:t>
+      </w:r>
+      <w:r>
+        <w:t xml:space="preserve">passa a ser chamado de </w:t>
+      </w:r>
+      <w:r>
+        <w:rPr>
+          <w:b/>
+          <w:bCs/>
+        </w:rPr>
+        <w:t>[link-caixa-</w:t>
+      </w:r>
+      <w:r>
+        <w:rPr>
+          <w:b/>
+          <w:bCs/>
+        </w:rPr>
+        <w:t>imóvel</w:t>
+      </w:r>
+      <w:r>
+        <w:t xml:space="preserve">] </w:t>
+      </w:r>
+      <w:r>
+        <w:t xml:space="preserve">o link de acesso a página original segue um padrão, basta copiar o texto e substituir o campo onde entre o numero do imóvel que </w:t>
+      </w:r>
+      <w:r>
+        <w:t>criamos o link de acesso</w:t>
+      </w:r>
+    </w:p>
+    <w:p>
+      <w:r>
+        <w:t>https://venda-imoveis.caixa.gov.br/sistema/detalhe-imovel.asp?hdnOrigem=index&amp;hdnimovel=</w:t>
+      </w:r>
+      <w:r>
+        <w:rPr>
+          <w:b/>
+          <w:bCs/>
+          <w:color w:val="FF0000"/>
+        </w:rPr>
+        <w:t>1444402960230</w:t>
+      </w:r>
+    </w:p>
+    <w:p>
+      <w:r>
+        <w:rPr>
+          <w:b/>
+          <w:bCs/>
+        </w:rPr>
+        <w:t>[link-caixa-</w:t>
+      </w:r>
+      <w:r>
+        <w:rPr>
+          <w:b/>
+          <w:bCs/>
+        </w:rPr>
+        <w:t>imagem</w:t>
+      </w:r>
+      <w:r>
+        <w:t xml:space="preserve">] o link de acesso a </w:t>
+      </w:r>
+      <w:r>
+        <w:t xml:space="preserve">imagem do imóvel que está no site da CAIXA também segue um padrão, </w:t>
+      </w:r>
+      <w:r>
+        <w:t>basta copiar o texto e substituir o campo onde entr</w:t>
+      </w:r>
+      <w:r>
+        <w:t>a</w:t>
+      </w:r>
+      <w:r>
+        <w:t xml:space="preserve"> o n</w:t>
+      </w:r>
+      <w:r>
+        <w:t>ú</w:t>
+      </w:r>
+      <w:r>
+        <w:t>mero do imóvel que criamos o link de acesso</w:t>
+      </w:r>
+    </w:p>
+    <w:p>
+      <w:r>
+        <w:t>https://venda-imoveis.caixa.gov.br/fotos/F</w:t>
+      </w:r>
+      <w:r>
+        <w:rPr>
+          <w:b/>
+          <w:bCs/>
+          <w:color w:val="FF0000"/>
+        </w:rPr>
+        <w:t>1444402960230</w:t>
+      </w:r>
+      <w:r>
+        <w:t>21.jpg</w:t>
+      </w:r>
+    </w:p>
+    <w:p>
+      <w:r>
+        <w:rPr>
+          <w:b/>
+          <w:bCs/>
+        </w:rPr>
+        <w:t>[link-caixa-</w:t>
+      </w:r>
+      <w:r>
+        <w:rPr>
+          <w:b/>
+          <w:bCs/>
+        </w:rPr>
+        <w:t>matricula</w:t>
+      </w:r>
+      <w:r>
+        <w:t xml:space="preserve">] o link de acesso a página original segue um padrão, basta copiar o texto e substituir o campo onde entre o </w:t>
+      </w:r>
+      <w:proofErr w:type="spellStart"/>
+      <w:r>
+        <w:t>numero</w:t>
+      </w:r>
+      <w:proofErr w:type="spellEnd"/>
+      <w:r>
+        <w:t xml:space="preserve"> do imóvel que criamos o link de acesso</w:t>
+      </w:r>
+    </w:p>
+    <w:p>
+      <w:r>
+        <w:t>https://venda-imoveis.caixa.gov.br/editais/matricula/RJ/</w:t>
+      </w:r>
+      <w:r>
+        <w:rPr>
+          <w:b/>
+          <w:bCs/>
+          <w:color w:val="FF0000"/>
+        </w:rPr>
+        <w:t>1444402960230</w:t>
+      </w:r>
+      <w:r>
+        <w:t>.pdf</w:t>
+      </w:r>
+    </w:p>
+    <w:p>
+      <w:r>
+        <w:t xml:space="preserve">Usamos o número </w:t>
+      </w:r>
+      <w:r>
+        <w:rPr>
+          <w:b/>
+          <w:bCs/>
+          <w:color w:val="FF0000"/>
+        </w:rPr>
+        <w:t>1444402960230</w:t>
+      </w:r>
+      <w:r>
+        <w:t xml:space="preserve"> para </w:t>
+      </w:r>
+      <w:r>
+        <w:t xml:space="preserve">identificar onde </w:t>
+      </w:r>
+      <w:proofErr w:type="gramStart"/>
+      <w:r>
+        <w:t>entra  número</w:t>
+      </w:r>
+      <w:proofErr w:type="gramEnd"/>
+      <w:r>
+        <w:t xml:space="preserve"> do imóvel</w:t>
+      </w:r>
+    </w:p>
+    <w:p/>
     <w:p>
       <w:r>
         <w:rPr>
@@ -3712,7 +4338,7 @@
           <w:b/>
           <w:bCs/>
         </w:rPr>
-        <w:t>Tipo do Imóvel</w:t>
+        <w:t>Data de geração</w:t>
       </w:r>
       <w:r>
         <w:rPr>
@@ -3722,19 +4348,89 @@
         <w:t>]</w:t>
       </w:r>
       <w:r>
-        <w:t>: (casa – apartamento – terreno</w:t>
-      </w:r>
-      <w:r>
-        <w:t xml:space="preserve"> </w:t>
-      </w:r>
-      <w:r>
-        <w:t>–</w:t>
-      </w:r>
-      <w:r>
-        <w:t xml:space="preserve"> </w:t>
-      </w:r>
-      <w:r>
-        <w:t>prédio – loja – sala - galpão</w:t>
+        <w:t xml:space="preserve"> = </w:t>
+      </w:r>
+      <w:r>
+        <w:t xml:space="preserve">Entra no nosso sistema com a finalidade de identificar a atualização dos dados do imóvel </w:t>
+      </w:r>
+      <w:r>
+        <w:t xml:space="preserve">que podem variar ao longo do tempo, vamos usar esta data para criar o registro das atualizações ao longo do período. Abaixo segue a lista dos campos que podem sofrer estas alterações. </w:t>
+      </w:r>
+    </w:p>
+    <w:p>
+      <w:pPr>
+        <w:ind w:left="708"/>
+      </w:pPr>
+      <w:r>
+        <w:t>[</w:t>
+      </w:r>
+      <w:r>
+        <w:t>Preço</w:t>
+      </w:r>
+      <w:r>
+        <w:t>]</w:t>
+      </w:r>
+      <w:r>
+        <w:t xml:space="preserve"> = passa a ser chamado de [valor de venda]</w:t>
+      </w:r>
+    </w:p>
+    <w:p>
+      <w:pPr>
+        <w:ind w:left="708"/>
+      </w:pPr>
+      <w:r>
+        <w:t>[</w:t>
+      </w:r>
+      <w:r>
+        <w:t>Valor de avaliação</w:t>
+      </w:r>
+      <w:r>
+        <w:t>]</w:t>
+      </w:r>
+    </w:p>
+    <w:p>
+      <w:pPr>
+        <w:ind w:left="708"/>
+      </w:pPr>
+      <w:r>
+        <w:t>[</w:t>
+      </w:r>
+      <w:r>
+        <w:t>Desconto</w:t>
+      </w:r>
+      <w:r>
+        <w:t>]</w:t>
+      </w:r>
+      <w:r>
+        <w:t xml:space="preserve"> = passa a ser chamado de [desconto-percentual]</w:t>
+      </w:r>
+    </w:p>
+    <w:p>
+      <w:pPr>
+        <w:ind w:left="708"/>
+      </w:pPr>
+      <w:r>
+        <w:t xml:space="preserve">[desconto-real] = [Valor de </w:t>
+      </w:r>
+      <w:r>
+        <w:t>avaliação] – [Preço]</w:t>
+      </w:r>
+    </w:p>
+    <w:p>
+      <w:pPr>
+        <w:ind w:left="708"/>
+      </w:pPr>
+      <w:r>
+        <w:t>Modalidade de venda = (</w:t>
+      </w:r>
+      <w:r>
+        <w:t>Venda Direta Online</w:t>
+      </w:r>
+      <w:r>
+        <w:t xml:space="preserve"> ou </w:t>
+      </w:r>
+      <w:r>
+        <w:t>Venda Online</w:t>
       </w:r>
       <w:r>
         <w:t>)</w:t>
@@ -3742,743 +4438,9 @@
     </w:p>
     <w:p>
       <w:pPr>
-        <w:rPr>
-          <w:b/>
-          <w:bCs/>
-        </w:rPr>
-      </w:pPr>
-      <w:r>
-        <w:rPr>
-          <w:b/>
-          <w:bCs/>
-        </w:rPr>
-        <w:t>[área-</w:t>
-      </w:r>
-      <w:r>
-        <w:rPr>
-          <w:b/>
-          <w:bCs/>
-        </w:rPr>
-        <w:t>total</w:t>
-      </w:r>
-      <w:r>
-        <w:rPr>
-          <w:b/>
-          <w:bCs/>
-        </w:rPr>
-        <w:t xml:space="preserve">] </w:t>
-      </w:r>
-      <w:r>
-        <w:rPr>
-          <w:b/>
-          <w:bCs/>
-        </w:rPr>
-        <w:t xml:space="preserve">; </w:t>
-      </w:r>
-      <w:r>
-        <w:rPr>
-          <w:b/>
-          <w:bCs/>
-        </w:rPr>
-        <w:t>[área-</w:t>
-      </w:r>
-      <w:r>
-        <w:rPr>
-          <w:b/>
-          <w:bCs/>
-        </w:rPr>
-        <w:t>privativa</w:t>
-      </w:r>
-      <w:r>
-        <w:rPr>
-          <w:b/>
-          <w:bCs/>
-        </w:rPr>
-        <w:t xml:space="preserve">] </w:t>
-      </w:r>
-      <w:r>
-        <w:rPr>
-          <w:b/>
-          <w:bCs/>
-        </w:rPr>
-        <w:t xml:space="preserve">; </w:t>
-      </w:r>
-      <w:r>
-        <w:rPr>
-          <w:b/>
-          <w:bCs/>
-        </w:rPr>
-        <w:t>[</w:t>
-      </w:r>
-      <w:proofErr w:type="spellStart"/>
-      <w:r>
-        <w:rPr>
-          <w:b/>
-          <w:bCs/>
-        </w:rPr>
-        <w:t>area</w:t>
-      </w:r>
-      <w:proofErr w:type="spellEnd"/>
-      <w:r>
-        <w:rPr>
-          <w:b/>
-          <w:bCs/>
-        </w:rPr>
-        <w:t>-</w:t>
-      </w:r>
-      <w:r>
-        <w:rPr>
-          <w:b/>
-          <w:bCs/>
-        </w:rPr>
-        <w:t>terreno</w:t>
-      </w:r>
-      <w:r>
-        <w:rPr>
-          <w:b/>
-          <w:bCs/>
-        </w:rPr>
-        <w:t xml:space="preserve">] </w:t>
-      </w:r>
-      <w:r>
-        <w:rPr>
-          <w:b/>
-          <w:bCs/>
-        </w:rPr>
-        <w:t xml:space="preserve">; </w:t>
-      </w:r>
-      <w:r>
-        <w:rPr>
-          <w:b/>
-          <w:bCs/>
-        </w:rPr>
-        <w:t>[</w:t>
-      </w:r>
-      <w:r>
-        <w:rPr>
-          <w:b/>
-          <w:bCs/>
-        </w:rPr>
-        <w:t>quartos</w:t>
-      </w:r>
-      <w:r>
-        <w:rPr>
-          <w:b/>
-          <w:bCs/>
-        </w:rPr>
-        <w:t>]</w:t>
-      </w:r>
-      <w:r>
-        <w:rPr>
-          <w:b/>
-          <w:bCs/>
-        </w:rPr>
-        <w:t xml:space="preserve">; </w:t>
-      </w:r>
-      <w:r>
-        <w:rPr>
-          <w:b/>
-          <w:bCs/>
-        </w:rPr>
-        <w:t xml:space="preserve">[banheiros] </w:t>
-      </w:r>
-      <w:proofErr w:type="spellStart"/>
-      <w:r>
-        <w:rPr>
-          <w:b/>
-          <w:bCs/>
-        </w:rPr>
-        <w:t>wc</w:t>
-      </w:r>
-      <w:proofErr w:type="spellEnd"/>
-      <w:r>
-        <w:rPr>
-          <w:b/>
-          <w:bCs/>
-        </w:rPr>
-        <w:t xml:space="preserve"> </w:t>
-      </w:r>
-      <w:r>
-        <w:rPr>
-          <w:b/>
-          <w:bCs/>
-        </w:rPr>
-        <w:t xml:space="preserve">= banheiros; </w:t>
-      </w:r>
-      <w:r>
-        <w:rPr>
-          <w:b/>
-          <w:bCs/>
-        </w:rPr>
-        <w:t>[área-</w:t>
-      </w:r>
-      <w:r>
-        <w:rPr>
-          <w:b/>
-          <w:bCs/>
-        </w:rPr>
-        <w:t>serviço</w:t>
-      </w:r>
-      <w:r>
-        <w:rPr>
-          <w:b/>
-          <w:bCs/>
-        </w:rPr>
-        <w:t xml:space="preserve">] </w:t>
-      </w:r>
-      <w:r>
-        <w:rPr>
-          <w:b/>
-          <w:bCs/>
-        </w:rPr>
-        <w:t xml:space="preserve">; </w:t>
-      </w:r>
-      <w:r>
-        <w:rPr>
-          <w:b/>
-          <w:bCs/>
-        </w:rPr>
-        <w:t>[</w:t>
-      </w:r>
-      <w:r>
-        <w:rPr>
-          <w:b/>
-          <w:bCs/>
-        </w:rPr>
-        <w:t>sala</w:t>
-      </w:r>
-      <w:r>
-        <w:rPr>
-          <w:b/>
-          <w:bCs/>
-        </w:rPr>
-        <w:t xml:space="preserve">] </w:t>
-      </w:r>
-      <w:r>
-        <w:rPr>
-          <w:b/>
-          <w:bCs/>
-        </w:rPr>
-        <w:t xml:space="preserve">; </w:t>
-      </w:r>
-      <w:r>
-        <w:rPr>
-          <w:b/>
-          <w:bCs/>
-        </w:rPr>
-        <w:t>[</w:t>
-      </w:r>
-      <w:r>
-        <w:rPr>
-          <w:b/>
-          <w:bCs/>
-        </w:rPr>
-        <w:t>cozinha</w:t>
-      </w:r>
-      <w:r>
-        <w:rPr>
-          <w:b/>
-          <w:bCs/>
-        </w:rPr>
-        <w:t xml:space="preserve">] </w:t>
-      </w:r>
-      <w:r>
-        <w:rPr>
-          <w:b/>
-          <w:bCs/>
-        </w:rPr>
-        <w:t xml:space="preserve">; </w:t>
-      </w:r>
-      <w:r>
-        <w:rPr>
-          <w:b/>
-          <w:bCs/>
-        </w:rPr>
-        <w:t>[</w:t>
-      </w:r>
-      <w:r>
-        <w:rPr>
-          <w:b/>
-          <w:bCs/>
-        </w:rPr>
-        <w:t>vagas</w:t>
-      </w:r>
-      <w:r>
-        <w:rPr>
-          <w:b/>
-          <w:bCs/>
-        </w:rPr>
-        <w:t>-</w:t>
-      </w:r>
-      <w:r>
-        <w:rPr>
-          <w:b/>
-          <w:bCs/>
-        </w:rPr>
-        <w:t>de</w:t>
-      </w:r>
-      <w:r>
-        <w:rPr>
-          <w:b/>
-          <w:bCs/>
-        </w:rPr>
-        <w:t>-</w:t>
-      </w:r>
-      <w:r>
-        <w:rPr>
-          <w:b/>
-          <w:bCs/>
-        </w:rPr>
-        <w:t>garagem</w:t>
-      </w:r>
-      <w:r>
-        <w:rPr>
-          <w:b/>
-          <w:bCs/>
-        </w:rPr>
-        <w:t>] ;</w:t>
-      </w:r>
-      <w:r>
-        <w:rPr>
-          <w:b/>
-          <w:bCs/>
-        </w:rPr>
-        <w:t xml:space="preserve"> </w:t>
-      </w:r>
-      <w:r>
-        <w:rPr>
-          <w:b/>
-          <w:bCs/>
-        </w:rPr>
-        <w:t>[</w:t>
-      </w:r>
-      <w:r>
-        <w:rPr>
-          <w:b/>
-          <w:bCs/>
-        </w:rPr>
-        <w:t>varanda</w:t>
-      </w:r>
-      <w:r>
-        <w:rPr>
-          <w:b/>
-          <w:bCs/>
-        </w:rPr>
-        <w:t>] ;</w:t>
-      </w:r>
-      <w:r>
-        <w:rPr>
-          <w:b/>
-          <w:bCs/>
-        </w:rPr>
-        <w:t xml:space="preserve"> </w:t>
-      </w:r>
-      <w:r>
-        <w:rPr>
-          <w:b/>
-          <w:bCs/>
-        </w:rPr>
-        <w:t>[</w:t>
-      </w:r>
-      <w:proofErr w:type="spellStart"/>
-      <w:r>
-        <w:rPr>
-          <w:b/>
-          <w:bCs/>
-        </w:rPr>
-        <w:t>terraco</w:t>
-      </w:r>
-      <w:proofErr w:type="spellEnd"/>
-      <w:r>
-        <w:rPr>
-          <w:b/>
-          <w:bCs/>
-        </w:rPr>
-        <w:t>] ; [</w:t>
-      </w:r>
-      <w:r>
-        <w:rPr>
-          <w:b/>
-          <w:bCs/>
-        </w:rPr>
-        <w:t>piscina</w:t>
-      </w:r>
-      <w:r>
-        <w:rPr>
-          <w:b/>
-          <w:bCs/>
-        </w:rPr>
-        <w:t xml:space="preserve">] ; [sauna] ; </w:t>
-      </w:r>
-      <w:r>
-        <w:rPr>
-          <w:b/>
-          <w:bCs/>
-        </w:rPr>
-        <w:t xml:space="preserve"> </w:t>
-      </w:r>
-      <w:r>
-        <w:rPr>
-          <w:b/>
-          <w:bCs/>
-        </w:rPr>
-        <w:t>[churrasqueira</w:t>
-      </w:r>
-      <w:r>
-        <w:rPr>
-          <w:b/>
-          <w:bCs/>
-        </w:rPr>
-        <w:t>]</w:t>
-      </w:r>
-    </w:p>
-    <w:p>
-      <w:r>
-        <w:t>Ainda temos alguns casos de erro de cadastro que precisamos tratar, segue exemplo:</w:t>
-      </w:r>
-    </w:p>
-    <w:p>
-      <w:r>
-        <w:t>Comercial, 0.00 de área total, 360.00 de área privativa, 360.00 de área do terreno.</w:t>
-      </w:r>
-    </w:p>
-    <w:p>
-      <w:r>
-        <w:t xml:space="preserve">O campo Comercial que está querendo se referir </w:t>
-      </w:r>
-      <w:proofErr w:type="spellStart"/>
-      <w:r>
-        <w:t>a</w:t>
-      </w:r>
-      <w:proofErr w:type="spellEnd"/>
-      <w:r>
-        <w:t xml:space="preserve"> tipo do imóvel na verdade é um terreno, “Comercial” é a natureza do imóvel, ou seja</w:t>
-      </w:r>
-      <w:r>
-        <w:t>,</w:t>
-      </w:r>
-      <w:r>
-        <w:t xml:space="preserve"> ele é feito para uso comercial assim como lojas e salas comerciais; da mesma forma que temos as casas e os apartamentos que são feitos para uso residencial. Como no geral o número de casas</w:t>
-      </w:r>
-      <w:r>
-        <w:t xml:space="preserve"> que podem ser de uso comercial é bem pequeno, vamos seguir o padrão de toda casa é residencial</w:t>
-      </w:r>
-    </w:p>
-    <w:p>
-      <w:r>
-        <w:t xml:space="preserve">Logo vamos criar mais um campo de informação </w:t>
-      </w:r>
-      <w:r>
-        <w:rPr>
-          <w:b/>
-          <w:bCs/>
-        </w:rPr>
-        <w:t>[Natureza do Imóvel]</w:t>
-      </w:r>
-    </w:p>
-    <w:p>
-      <w:r>
-        <w:br/>
-      </w:r>
-    </w:p>
-    <w:p>
-      <w:r>
-        <w:rPr>
-          <w:b/>
-          <w:bCs/>
-        </w:rPr>
-        <w:t>[</w:t>
-      </w:r>
-      <w:r>
-        <w:rPr>
-          <w:b/>
-          <w:bCs/>
-        </w:rPr>
-        <w:t>Link de acesso</w:t>
-      </w:r>
-      <w:r>
-        <w:rPr>
-          <w:b/>
-          <w:bCs/>
-        </w:rPr>
-        <w:t>]</w:t>
-      </w:r>
-      <w:r>
-        <w:t xml:space="preserve"> = </w:t>
-      </w:r>
-      <w:r>
-        <w:t xml:space="preserve">passa a ser chamado de </w:t>
-      </w:r>
-      <w:r>
-        <w:rPr>
-          <w:b/>
-          <w:bCs/>
-        </w:rPr>
-        <w:t>[link-caixa-</w:t>
-      </w:r>
-      <w:r>
-        <w:rPr>
-          <w:b/>
-          <w:bCs/>
-        </w:rPr>
-        <w:t>imóvel</w:t>
-      </w:r>
-      <w:r>
-        <w:t xml:space="preserve">] </w:t>
-      </w:r>
-      <w:r>
-        <w:t xml:space="preserve">o link de acesso a página original segue um padrão, basta copiar o texto e substituir o campo onde entre o numero do imóvel que </w:t>
-      </w:r>
-      <w:r>
-        <w:t>criamos o link de acesso</w:t>
-      </w:r>
-    </w:p>
-    <w:p>
-      <w:r>
-        <w:t>https://venda-imoveis.caixa.gov.br/sistema/detalhe-imovel.asp?hdnOrigem=index&amp;hdnimovel=</w:t>
-      </w:r>
-      <w:r>
-        <w:rPr>
-          <w:b/>
-          <w:bCs/>
-          <w:color w:val="FF0000"/>
-        </w:rPr>
-        <w:t>1444402960230</w:t>
-      </w:r>
-    </w:p>
-    <w:p>
-      <w:r>
-        <w:rPr>
-          <w:b/>
-          <w:bCs/>
-        </w:rPr>
-        <w:t>[link-caixa-</w:t>
-      </w:r>
-      <w:r>
-        <w:rPr>
-          <w:b/>
-          <w:bCs/>
-        </w:rPr>
-        <w:t>imagem</w:t>
-      </w:r>
-      <w:r>
-        <w:t xml:space="preserve">] o link de acesso a </w:t>
-      </w:r>
-      <w:r>
-        <w:t xml:space="preserve">imagem do imóvel que está no site da CAIXA também segue um padrão, </w:t>
-      </w:r>
-      <w:r>
-        <w:t>basta copiar o texto e substituir o campo onde entr</w:t>
-      </w:r>
-      <w:r>
-        <w:t>a</w:t>
-      </w:r>
-      <w:r>
-        <w:t xml:space="preserve"> o n</w:t>
-      </w:r>
-      <w:r>
-        <w:t>ú</w:t>
-      </w:r>
-      <w:r>
-        <w:t>mero do imóvel que criamos o link de acesso</w:t>
-      </w:r>
-    </w:p>
-    <w:p>
-      <w:r>
-        <w:t>https://venda-imoveis.caixa.gov.br/fotos/F</w:t>
-      </w:r>
-      <w:r>
-        <w:rPr>
-          <w:b/>
-          <w:bCs/>
-          <w:color w:val="FF0000"/>
-        </w:rPr>
-        <w:t>1444402960230</w:t>
-      </w:r>
-      <w:r>
-        <w:t>21.jpg</w:t>
-      </w:r>
-    </w:p>
-    <w:p>
-      <w:r>
-        <w:rPr>
-          <w:b/>
-          <w:bCs/>
-        </w:rPr>
-        <w:t>[link-caixa-</w:t>
-      </w:r>
-      <w:r>
-        <w:rPr>
-          <w:b/>
-          <w:bCs/>
-        </w:rPr>
-        <w:t>matricula</w:t>
-      </w:r>
-      <w:r>
-        <w:t xml:space="preserve">] o link de acesso a página original segue um padrão, basta copiar o texto e substituir o campo onde entre o </w:t>
-      </w:r>
-      <w:proofErr w:type="spellStart"/>
-      <w:r>
-        <w:t>numero</w:t>
-      </w:r>
-      <w:proofErr w:type="spellEnd"/>
-      <w:r>
-        <w:t xml:space="preserve"> do imóvel que criamos o link de acesso</w:t>
-      </w:r>
-    </w:p>
-    <w:p>
-      <w:r>
-        <w:t>https://venda-imoveis.caixa.gov.br/editais/matricula/RJ/</w:t>
-      </w:r>
-      <w:r>
-        <w:rPr>
-          <w:b/>
-          <w:bCs/>
-          <w:color w:val="FF0000"/>
-        </w:rPr>
-        <w:t>1444402960230</w:t>
-      </w:r>
-      <w:r>
-        <w:t>.pdf</w:t>
-      </w:r>
-    </w:p>
-    <w:p>
-      <w:r>
-        <w:t xml:space="preserve">Usamos o número </w:t>
-      </w:r>
-      <w:r>
-        <w:rPr>
-          <w:b/>
-          <w:bCs/>
-          <w:color w:val="FF0000"/>
-        </w:rPr>
-        <w:t>1444402960230</w:t>
-      </w:r>
-      <w:r>
-        <w:t xml:space="preserve"> para </w:t>
-      </w:r>
-      <w:r>
-        <w:t>identificar onde entra  número do imóvel</w:t>
-      </w:r>
-    </w:p>
-    <w:p/>
-    <w:p>
-      <w:r>
-        <w:rPr>
-          <w:b/>
-          <w:bCs/>
-        </w:rPr>
-        <w:t>[</w:t>
-      </w:r>
-      <w:r>
-        <w:rPr>
-          <w:b/>
-          <w:bCs/>
-        </w:rPr>
-        <w:t>Data de geração</w:t>
-      </w:r>
-      <w:r>
-        <w:rPr>
-          <w:b/>
-          <w:bCs/>
-        </w:rPr>
-        <w:t>]</w:t>
-      </w:r>
-      <w:r>
-        <w:t xml:space="preserve"> = </w:t>
-      </w:r>
-      <w:r>
-        <w:t xml:space="preserve">Entra no nosso sistema com a finalidade de identificar a atualização dos dados do imóvel </w:t>
-      </w:r>
-      <w:r>
-        <w:t xml:space="preserve">que podem variar ao longo do tempo, vamos usar esta data para criar o registro das atualizações ao longo do período. Abaixo segue a lista dos campos que podem sofrer estas alterações. </w:t>
-      </w:r>
-    </w:p>
-    <w:p>
-      <w:pPr>
         <w:ind w:left="708"/>
       </w:pPr>
       <w:r>
-        <w:t>[</w:t>
-      </w:r>
-      <w:r>
-        <w:t>Preço</w:t>
-      </w:r>
-      <w:r>
-        <w:t>]</w:t>
-      </w:r>
-      <w:r>
-        <w:t xml:space="preserve"> = passa a ser chamado de [valor de venda]</w:t>
-      </w:r>
-    </w:p>
-    <w:p>
-      <w:pPr>
-        <w:ind w:left="708"/>
-      </w:pPr>
-      <w:r>
-        <w:t>[</w:t>
-      </w:r>
-      <w:r>
-        <w:t>Valor de avaliação</w:t>
-      </w:r>
-      <w:r>
-        <w:t>]</w:t>
-      </w:r>
-    </w:p>
-    <w:p>
-      <w:pPr>
-        <w:ind w:left="708"/>
-      </w:pPr>
-      <w:r>
-        <w:t>[</w:t>
-      </w:r>
-      <w:r>
-        <w:t>Desconto</w:t>
-      </w:r>
-      <w:r>
-        <w:t>]</w:t>
-      </w:r>
-      <w:r>
-        <w:t xml:space="preserve"> = passa a ser chamado de [desconto-percentual]</w:t>
-      </w:r>
-    </w:p>
-    <w:p>
-      <w:pPr>
-        <w:ind w:left="708"/>
-      </w:pPr>
-      <w:r>
-        <w:t xml:space="preserve">[desconto-real] = [Valor de </w:t>
-      </w:r>
-      <w:r>
-        <w:t>avaliação] – [Preço]</w:t>
-      </w:r>
-    </w:p>
-    <w:p>
-      <w:pPr>
-        <w:ind w:left="708"/>
-      </w:pPr>
-      <w:r>
-        <w:t>Modalidade de venda = (</w:t>
-      </w:r>
-      <w:r>
-        <w:t>Venda Direta Online</w:t>
-      </w:r>
-      <w:r>
-        <w:t xml:space="preserve"> ou </w:t>
-      </w:r>
-      <w:r>
-        <w:t>Venda Online</w:t>
-      </w:r>
-      <w:r>
-        <w:t>)</w:t>
-      </w:r>
-    </w:p>
-    <w:p>
-      <w:pPr>
-        <w:ind w:left="708"/>
-      </w:pPr>
-      <w:r>
-        <w:lastRenderedPageBreak/>
         <w:t>Leiloeiro = 5% do [valor de venda]</w:t>
       </w:r>
     </w:p>
@@ -4605,8 +4567,13 @@
     </w:p>
     <w:p>
       <w:r>
-        <w:t>Existem informações sobre o imóvel que só aparecem na página oficial do imóvel e para resgatar estas informações vamos ter que fazer uma raspagem; Importante</w:t>
-      </w:r>
+        <w:t xml:space="preserve">Existem informações sobre o imóvel que só aparecem na página oficial do imóvel e para resgatar estas informações vamos ter que fazer uma raspagem; </w:t>
+      </w:r>
+      <w:proofErr w:type="gramStart"/>
+      <w:r>
+        <w:t>Importante</w:t>
+      </w:r>
+      <w:proofErr w:type="gramEnd"/>
       <w:r>
         <w:t xml:space="preserve"> </w:t>
       </w:r>
@@ -4715,6 +4682,7 @@
         </w:numPr>
       </w:pPr>
       <w:r>
+        <w:lastRenderedPageBreak/>
         <w:t>Permite utilização de FGTS. Consulte condições e enquadramento.</w:t>
       </w:r>
     </w:p>
@@ -4768,7 +4736,6 @@
         </w:numPr>
       </w:pPr>
       <w:r>
-        <w:lastRenderedPageBreak/>
         <w:t>Tributos: Sob responsabilidade do comprador.</w:t>
       </w:r>
     </w:p>
@@ -5087,6 +5054,7 @@
     </w:p>
     <w:p>
       <w:r>
+        <w:lastRenderedPageBreak/>
         <w:t xml:space="preserve">Se [valor de avaliação] igual / maior que </w:t>
       </w:r>
       <w:r>
@@ -5196,7 +5164,6 @@
         <w:rPr>
           <w:color w:val="ED7D31" w:themeColor="accent2"/>
         </w:rPr>
-        <w:lastRenderedPageBreak/>
         <w:t>Fundo de Reserva</w:t>
       </w:r>
       <w:r>
@@ -5369,7 +5336,15 @@
       </w:r>
       <w:proofErr w:type="spellEnd"/>
       <w:r>
-        <w:t xml:space="preserve"> + [energia] + [agua] + [venda] + [</w:t>
+        <w:t xml:space="preserve"> + [energia] + [</w:t>
+      </w:r>
+      <w:proofErr w:type="gramStart"/>
+      <w:r>
+        <w:t>agua</w:t>
+      </w:r>
+      <w:proofErr w:type="gramEnd"/>
+      <w:r>
+        <w:t>] + [venda] + [</w:t>
       </w:r>
       <w:proofErr w:type="spellStart"/>
       <w:r>
@@ -5447,235 +5422,9 @@
 <file path=word/numbering.xml><?xml version="1.0" encoding="utf-8"?>
 <w:numbering xmlns:wpc="http://schemas.microsoft.com/office/word/2010/wordprocessingCanvas" xmlns:cx="http://schemas.microsoft.com/office/drawing/2014/chartex" xmlns:cx1="http://schemas.microsoft.com/office/drawing/2015/9/8/chartex" xmlns:cx2="http://schemas.microsoft.com/office/drawing/2015/10/21/chartex" xmlns:cx3="http://schemas.microsoft.com/office/drawing/2016/5/9/chartex" xmlns:cx4="http://schemas.microsoft.com/office/drawing/2016/5/10/chartex" xmlns:cx5="http://schemas.microsoft.com/office/drawing/2016/5/11/chartex" xmlns:cx6="http://schemas.microsoft.com/office/drawing/2016/5/12/chartex" xmlns:cx7="http://schemas.microsoft.com/office/drawing/2016/5/13/chartex" xmlns:cx8="http://schemas.microsoft.com/office/drawing/2016/5/14/chartex" xmlns:mc="http://schemas.openxmlformats.org/markup-compatibility/2006" xmlns:aink="http://schemas.microsoft.com/office/drawing/2016/ink" xmlns:am3d="http://schemas.microsoft.com/office/drawing/2017/model3d" xmlns:o="urn:schemas-microsoft-com:office:office" xmlns:oel="http://schemas.microsoft.com/office/2019/extlst" xmlns:r="http://schemas.openxmlformats.org/officeDocument/2006/relationships" xmlns:m="http://schemas.openxmlformats.org/officeDocument/2006/math" xmlns:v="urn:schemas-microsoft-com:vml" xmlns:wp14="http://schemas.microsoft.com/office/word/2010/wordprocessingDrawing" xmlns:wp="http://schemas.openxmlformats.org/drawingml/2006/wordprocessingDrawing" xmlns:w10="urn:schemas-microsoft-com:office:word" xmlns:w="http://schemas.openxmlformats.org/wordprocessingml/2006/main" xmlns:w14="http://schemas.microsoft.com/office/word/2010/wordml" xmlns:w15="http://schemas.microsoft.com/office/word/2012/wordml" xmlns:w16cex="http://schemas.microsoft.com/office/word/2018/wordml/cex" xmlns:w16cid="http://schemas.microsoft.com/office/word/2016/wordml/cid" xmlns:w16="http://schemas.microsoft.com/office/word/2018/wordml" xmlns:w16du="http://schemas.microsoft.com/office/word/2023/wordml/word16du" xmlns:w16sdtdh="http://schemas.microsoft.com/office/word/2020/wordml/sdtdatahash" xmlns:w16se="http://schemas.microsoft.com/office/word/2015/wordml/symex" xmlns:wpg="http://schemas.microsoft.com/office/word/2010/wordprocessingGroup" xmlns:wpi="http://schemas.microsoft.com/office/word/2010/wordprocessingInk" xmlns:wne="http://schemas.microsoft.com/office/word/2006/wordml" xmlns:wps="http://schemas.microsoft.com/office/word/2010/wordprocessingShape" mc:Ignorable="w14 w15 w16se w16cid w16 w16cex w16sdtdh w16du wp14">
   <w:abstractNum w:abstractNumId="0" w15:restartNumberingAfterBreak="0">
-    <w:nsid w:val="319B3A6C"/>
-    <w:multiLevelType w:val="hybridMultilevel"/>
-    <w:tmpl w:val="E1540B40"/>
-    <w:lvl w:ilvl="0" w:tplc="04160001">
-      <w:start w:val="1"/>
-      <w:numFmt w:val="bullet"/>
-      <w:lvlText w:val=""/>
-      <w:lvlJc w:val="left"/>
-      <w:pPr>
-        <w:ind w:left="720" w:hanging="360"/>
-      </w:pPr>
-      <w:rPr>
-        <w:rFonts w:ascii="Symbol" w:hAnsi="Symbol" w:hint="default"/>
-      </w:rPr>
-    </w:lvl>
-    <w:lvl w:ilvl="1" w:tplc="04160003" w:tentative="1">
-      <w:start w:val="1"/>
-      <w:numFmt w:val="bullet"/>
-      <w:lvlText w:val="o"/>
-      <w:lvlJc w:val="left"/>
-      <w:pPr>
-        <w:ind w:left="1440" w:hanging="360"/>
-      </w:pPr>
-      <w:rPr>
-        <w:rFonts w:ascii="Courier New" w:hAnsi="Courier New" w:cs="Courier New" w:hint="default"/>
-      </w:rPr>
-    </w:lvl>
-    <w:lvl w:ilvl="2" w:tplc="04160005" w:tentative="1">
-      <w:start w:val="1"/>
-      <w:numFmt w:val="bullet"/>
-      <w:lvlText w:val=""/>
-      <w:lvlJc w:val="left"/>
-      <w:pPr>
-        <w:ind w:left="2160" w:hanging="360"/>
-      </w:pPr>
-      <w:rPr>
-        <w:rFonts w:ascii="Wingdings" w:hAnsi="Wingdings" w:hint="default"/>
-      </w:rPr>
-    </w:lvl>
-    <w:lvl w:ilvl="3" w:tplc="04160001" w:tentative="1">
-      <w:start w:val="1"/>
-      <w:numFmt w:val="bullet"/>
-      <w:lvlText w:val=""/>
-      <w:lvlJc w:val="left"/>
-      <w:pPr>
-        <w:ind w:left="2880" w:hanging="360"/>
-      </w:pPr>
-      <w:rPr>
-        <w:rFonts w:ascii="Symbol" w:hAnsi="Symbol" w:hint="default"/>
-      </w:rPr>
-    </w:lvl>
-    <w:lvl w:ilvl="4" w:tplc="04160003" w:tentative="1">
-      <w:start w:val="1"/>
-      <w:numFmt w:val="bullet"/>
-      <w:lvlText w:val="o"/>
-      <w:lvlJc w:val="left"/>
-      <w:pPr>
-        <w:ind w:left="3600" w:hanging="360"/>
-      </w:pPr>
-      <w:rPr>
-        <w:rFonts w:ascii="Courier New" w:hAnsi="Courier New" w:cs="Courier New" w:hint="default"/>
-      </w:rPr>
-    </w:lvl>
-    <w:lvl w:ilvl="5" w:tplc="04160005" w:tentative="1">
-      <w:start w:val="1"/>
-      <w:numFmt w:val="bullet"/>
-      <w:lvlText w:val=""/>
-      <w:lvlJc w:val="left"/>
-      <w:pPr>
-        <w:ind w:left="4320" w:hanging="360"/>
-      </w:pPr>
-      <w:rPr>
-        <w:rFonts w:ascii="Wingdings" w:hAnsi="Wingdings" w:hint="default"/>
-      </w:rPr>
-    </w:lvl>
-    <w:lvl w:ilvl="6" w:tplc="04160001" w:tentative="1">
-      <w:start w:val="1"/>
-      <w:numFmt w:val="bullet"/>
-      <w:lvlText w:val=""/>
-      <w:lvlJc w:val="left"/>
-      <w:pPr>
-        <w:ind w:left="5040" w:hanging="360"/>
-      </w:pPr>
-      <w:rPr>
-        <w:rFonts w:ascii="Symbol" w:hAnsi="Symbol" w:hint="default"/>
-      </w:rPr>
-    </w:lvl>
-    <w:lvl w:ilvl="7" w:tplc="04160003" w:tentative="1">
-      <w:start w:val="1"/>
-      <w:numFmt w:val="bullet"/>
-      <w:lvlText w:val="o"/>
-      <w:lvlJc w:val="left"/>
-      <w:pPr>
-        <w:ind w:left="5760" w:hanging="360"/>
-      </w:pPr>
-      <w:rPr>
-        <w:rFonts w:ascii="Courier New" w:hAnsi="Courier New" w:cs="Courier New" w:hint="default"/>
-      </w:rPr>
-    </w:lvl>
-    <w:lvl w:ilvl="8" w:tplc="04160005" w:tentative="1">
-      <w:start w:val="1"/>
-      <w:numFmt w:val="bullet"/>
-      <w:lvlText w:val=""/>
-      <w:lvlJc w:val="left"/>
-      <w:pPr>
-        <w:ind w:left="6480" w:hanging="360"/>
-      </w:pPr>
-      <w:rPr>
-        <w:rFonts w:ascii="Wingdings" w:hAnsi="Wingdings" w:hint="default"/>
-      </w:rPr>
-    </w:lvl>
-  </w:abstractNum>
-  <w:abstractNum w:abstractNumId="1" w15:restartNumberingAfterBreak="0">
-    <w:nsid w:val="3C9F691C"/>
-    <w:multiLevelType w:val="hybridMultilevel"/>
-    <w:tmpl w:val="4A10D0CA"/>
-    <w:lvl w:ilvl="0" w:tplc="04160001">
-      <w:start w:val="1"/>
-      <w:numFmt w:val="bullet"/>
-      <w:lvlText w:val=""/>
-      <w:lvlJc w:val="left"/>
-      <w:pPr>
-        <w:ind w:left="720" w:hanging="360"/>
-      </w:pPr>
-      <w:rPr>
-        <w:rFonts w:ascii="Symbol" w:hAnsi="Symbol" w:hint="default"/>
-      </w:rPr>
-    </w:lvl>
-    <w:lvl w:ilvl="1" w:tplc="04160003" w:tentative="1">
-      <w:start w:val="1"/>
-      <w:numFmt w:val="bullet"/>
-      <w:lvlText w:val="o"/>
-      <w:lvlJc w:val="left"/>
-      <w:pPr>
-        <w:ind w:left="1440" w:hanging="360"/>
-      </w:pPr>
-      <w:rPr>
-        <w:rFonts w:ascii="Courier New" w:hAnsi="Courier New" w:cs="Courier New" w:hint="default"/>
-      </w:rPr>
-    </w:lvl>
-    <w:lvl w:ilvl="2" w:tplc="04160005" w:tentative="1">
-      <w:start w:val="1"/>
-      <w:numFmt w:val="bullet"/>
-      <w:lvlText w:val=""/>
-      <w:lvlJc w:val="left"/>
-      <w:pPr>
-        <w:ind w:left="2160" w:hanging="360"/>
-      </w:pPr>
-      <w:rPr>
-        <w:rFonts w:ascii="Wingdings" w:hAnsi="Wingdings" w:hint="default"/>
-      </w:rPr>
-    </w:lvl>
-    <w:lvl w:ilvl="3" w:tplc="04160001" w:tentative="1">
-      <w:start w:val="1"/>
-      <w:numFmt w:val="bullet"/>
-      <w:lvlText w:val=""/>
-      <w:lvlJc w:val="left"/>
-      <w:pPr>
-        <w:ind w:left="2880" w:hanging="360"/>
-      </w:pPr>
-      <w:rPr>
-        <w:rFonts w:ascii="Symbol" w:hAnsi="Symbol" w:hint="default"/>
-      </w:rPr>
-    </w:lvl>
-    <w:lvl w:ilvl="4" w:tplc="04160003" w:tentative="1">
-      <w:start w:val="1"/>
-      <w:numFmt w:val="bullet"/>
-      <w:lvlText w:val="o"/>
-      <w:lvlJc w:val="left"/>
-      <w:pPr>
-        <w:ind w:left="3600" w:hanging="360"/>
-      </w:pPr>
-      <w:rPr>
-        <w:rFonts w:ascii="Courier New" w:hAnsi="Courier New" w:cs="Courier New" w:hint="default"/>
-      </w:rPr>
-    </w:lvl>
-    <w:lvl w:ilvl="5" w:tplc="04160005" w:tentative="1">
-      <w:start w:val="1"/>
-      <w:numFmt w:val="bullet"/>
-      <w:lvlText w:val=""/>
-      <w:lvlJc w:val="left"/>
-      <w:pPr>
-        <w:ind w:left="4320" w:hanging="360"/>
-      </w:pPr>
-      <w:rPr>
-        <w:rFonts w:ascii="Wingdings" w:hAnsi="Wingdings" w:hint="default"/>
-      </w:rPr>
-    </w:lvl>
-    <w:lvl w:ilvl="6" w:tplc="04160001" w:tentative="1">
-      <w:start w:val="1"/>
-      <w:numFmt w:val="bullet"/>
-      <w:lvlText w:val=""/>
-      <w:lvlJc w:val="left"/>
-      <w:pPr>
-        <w:ind w:left="5040" w:hanging="360"/>
-      </w:pPr>
-      <w:rPr>
-        <w:rFonts w:ascii="Symbol" w:hAnsi="Symbol" w:hint="default"/>
-      </w:rPr>
-    </w:lvl>
-    <w:lvl w:ilvl="7" w:tplc="04160003" w:tentative="1">
-      <w:start w:val="1"/>
-      <w:numFmt w:val="bullet"/>
-      <w:lvlText w:val="o"/>
-      <w:lvlJc w:val="left"/>
-      <w:pPr>
-        <w:ind w:left="5760" w:hanging="360"/>
-      </w:pPr>
-      <w:rPr>
-        <w:rFonts w:ascii="Courier New" w:hAnsi="Courier New" w:cs="Courier New" w:hint="default"/>
-      </w:rPr>
-    </w:lvl>
-    <w:lvl w:ilvl="8" w:tplc="04160005" w:tentative="1">
-      <w:start w:val="1"/>
-      <w:numFmt w:val="bullet"/>
-      <w:lvlText w:val=""/>
-      <w:lvlJc w:val="left"/>
-      <w:pPr>
-        <w:ind w:left="6480" w:hanging="360"/>
-      </w:pPr>
-      <w:rPr>
-        <w:rFonts w:ascii="Wingdings" w:hAnsi="Wingdings" w:hint="default"/>
-      </w:rPr>
-    </w:lvl>
-  </w:abstractNum>
-  <w:abstractNum w:abstractNumId="2" w15:restartNumberingAfterBreak="0">
-    <w:nsid w:val="421733B9"/>
+    <w:nsid w:val="18116737"/>
     <w:multiLevelType w:val="multilevel"/>
-    <w:tmpl w:val="E8662CB6"/>
+    <w:tmpl w:val="C62AF044"/>
     <w:lvl w:ilvl="0">
       <w:start w:val="1"/>
       <w:numFmt w:val="bullet"/>
@@ -5821,10 +5570,236 @@
       </w:rPr>
     </w:lvl>
   </w:abstractNum>
+  <w:abstractNum w:abstractNumId="1" w15:restartNumberingAfterBreak="0">
+    <w:nsid w:val="319B3A6C"/>
+    <w:multiLevelType w:val="hybridMultilevel"/>
+    <w:tmpl w:val="E1540B40"/>
+    <w:lvl w:ilvl="0" w:tplc="04160001">
+      <w:start w:val="1"/>
+      <w:numFmt w:val="bullet"/>
+      <w:lvlText w:val=""/>
+      <w:lvlJc w:val="left"/>
+      <w:pPr>
+        <w:ind w:left="720" w:hanging="360"/>
+      </w:pPr>
+      <w:rPr>
+        <w:rFonts w:ascii="Symbol" w:hAnsi="Symbol" w:hint="default"/>
+      </w:rPr>
+    </w:lvl>
+    <w:lvl w:ilvl="1" w:tplc="04160003" w:tentative="1">
+      <w:start w:val="1"/>
+      <w:numFmt w:val="bullet"/>
+      <w:lvlText w:val="o"/>
+      <w:lvlJc w:val="left"/>
+      <w:pPr>
+        <w:ind w:left="1440" w:hanging="360"/>
+      </w:pPr>
+      <w:rPr>
+        <w:rFonts w:ascii="Courier New" w:hAnsi="Courier New" w:cs="Courier New" w:hint="default"/>
+      </w:rPr>
+    </w:lvl>
+    <w:lvl w:ilvl="2" w:tplc="04160005" w:tentative="1">
+      <w:start w:val="1"/>
+      <w:numFmt w:val="bullet"/>
+      <w:lvlText w:val=""/>
+      <w:lvlJc w:val="left"/>
+      <w:pPr>
+        <w:ind w:left="2160" w:hanging="360"/>
+      </w:pPr>
+      <w:rPr>
+        <w:rFonts w:ascii="Wingdings" w:hAnsi="Wingdings" w:hint="default"/>
+      </w:rPr>
+    </w:lvl>
+    <w:lvl w:ilvl="3" w:tplc="04160001" w:tentative="1">
+      <w:start w:val="1"/>
+      <w:numFmt w:val="bullet"/>
+      <w:lvlText w:val=""/>
+      <w:lvlJc w:val="left"/>
+      <w:pPr>
+        <w:ind w:left="2880" w:hanging="360"/>
+      </w:pPr>
+      <w:rPr>
+        <w:rFonts w:ascii="Symbol" w:hAnsi="Symbol" w:hint="default"/>
+      </w:rPr>
+    </w:lvl>
+    <w:lvl w:ilvl="4" w:tplc="04160003" w:tentative="1">
+      <w:start w:val="1"/>
+      <w:numFmt w:val="bullet"/>
+      <w:lvlText w:val="o"/>
+      <w:lvlJc w:val="left"/>
+      <w:pPr>
+        <w:ind w:left="3600" w:hanging="360"/>
+      </w:pPr>
+      <w:rPr>
+        <w:rFonts w:ascii="Courier New" w:hAnsi="Courier New" w:cs="Courier New" w:hint="default"/>
+      </w:rPr>
+    </w:lvl>
+    <w:lvl w:ilvl="5" w:tplc="04160005" w:tentative="1">
+      <w:start w:val="1"/>
+      <w:numFmt w:val="bullet"/>
+      <w:lvlText w:val=""/>
+      <w:lvlJc w:val="left"/>
+      <w:pPr>
+        <w:ind w:left="4320" w:hanging="360"/>
+      </w:pPr>
+      <w:rPr>
+        <w:rFonts w:ascii="Wingdings" w:hAnsi="Wingdings" w:hint="default"/>
+      </w:rPr>
+    </w:lvl>
+    <w:lvl w:ilvl="6" w:tplc="04160001" w:tentative="1">
+      <w:start w:val="1"/>
+      <w:numFmt w:val="bullet"/>
+      <w:lvlText w:val=""/>
+      <w:lvlJc w:val="left"/>
+      <w:pPr>
+        <w:ind w:left="5040" w:hanging="360"/>
+      </w:pPr>
+      <w:rPr>
+        <w:rFonts w:ascii="Symbol" w:hAnsi="Symbol" w:hint="default"/>
+      </w:rPr>
+    </w:lvl>
+    <w:lvl w:ilvl="7" w:tplc="04160003" w:tentative="1">
+      <w:start w:val="1"/>
+      <w:numFmt w:val="bullet"/>
+      <w:lvlText w:val="o"/>
+      <w:lvlJc w:val="left"/>
+      <w:pPr>
+        <w:ind w:left="5760" w:hanging="360"/>
+      </w:pPr>
+      <w:rPr>
+        <w:rFonts w:ascii="Courier New" w:hAnsi="Courier New" w:cs="Courier New" w:hint="default"/>
+      </w:rPr>
+    </w:lvl>
+    <w:lvl w:ilvl="8" w:tplc="04160005" w:tentative="1">
+      <w:start w:val="1"/>
+      <w:numFmt w:val="bullet"/>
+      <w:lvlText w:val=""/>
+      <w:lvlJc w:val="left"/>
+      <w:pPr>
+        <w:ind w:left="6480" w:hanging="360"/>
+      </w:pPr>
+      <w:rPr>
+        <w:rFonts w:ascii="Wingdings" w:hAnsi="Wingdings" w:hint="default"/>
+      </w:rPr>
+    </w:lvl>
+  </w:abstractNum>
+  <w:abstractNum w:abstractNumId="2" w15:restartNumberingAfterBreak="0">
+    <w:nsid w:val="3C9F691C"/>
+    <w:multiLevelType w:val="hybridMultilevel"/>
+    <w:tmpl w:val="4A10D0CA"/>
+    <w:lvl w:ilvl="0" w:tplc="04160001">
+      <w:start w:val="1"/>
+      <w:numFmt w:val="bullet"/>
+      <w:lvlText w:val=""/>
+      <w:lvlJc w:val="left"/>
+      <w:pPr>
+        <w:ind w:left="720" w:hanging="360"/>
+      </w:pPr>
+      <w:rPr>
+        <w:rFonts w:ascii="Symbol" w:hAnsi="Symbol" w:hint="default"/>
+      </w:rPr>
+    </w:lvl>
+    <w:lvl w:ilvl="1" w:tplc="04160003" w:tentative="1">
+      <w:start w:val="1"/>
+      <w:numFmt w:val="bullet"/>
+      <w:lvlText w:val="o"/>
+      <w:lvlJc w:val="left"/>
+      <w:pPr>
+        <w:ind w:left="1440" w:hanging="360"/>
+      </w:pPr>
+      <w:rPr>
+        <w:rFonts w:ascii="Courier New" w:hAnsi="Courier New" w:cs="Courier New" w:hint="default"/>
+      </w:rPr>
+    </w:lvl>
+    <w:lvl w:ilvl="2" w:tplc="04160005" w:tentative="1">
+      <w:start w:val="1"/>
+      <w:numFmt w:val="bullet"/>
+      <w:lvlText w:val=""/>
+      <w:lvlJc w:val="left"/>
+      <w:pPr>
+        <w:ind w:left="2160" w:hanging="360"/>
+      </w:pPr>
+      <w:rPr>
+        <w:rFonts w:ascii="Wingdings" w:hAnsi="Wingdings" w:hint="default"/>
+      </w:rPr>
+    </w:lvl>
+    <w:lvl w:ilvl="3" w:tplc="04160001" w:tentative="1">
+      <w:start w:val="1"/>
+      <w:numFmt w:val="bullet"/>
+      <w:lvlText w:val=""/>
+      <w:lvlJc w:val="left"/>
+      <w:pPr>
+        <w:ind w:left="2880" w:hanging="360"/>
+      </w:pPr>
+      <w:rPr>
+        <w:rFonts w:ascii="Symbol" w:hAnsi="Symbol" w:hint="default"/>
+      </w:rPr>
+    </w:lvl>
+    <w:lvl w:ilvl="4" w:tplc="04160003" w:tentative="1">
+      <w:start w:val="1"/>
+      <w:numFmt w:val="bullet"/>
+      <w:lvlText w:val="o"/>
+      <w:lvlJc w:val="left"/>
+      <w:pPr>
+        <w:ind w:left="3600" w:hanging="360"/>
+      </w:pPr>
+      <w:rPr>
+        <w:rFonts w:ascii="Courier New" w:hAnsi="Courier New" w:cs="Courier New" w:hint="default"/>
+      </w:rPr>
+    </w:lvl>
+    <w:lvl w:ilvl="5" w:tplc="04160005" w:tentative="1">
+      <w:start w:val="1"/>
+      <w:numFmt w:val="bullet"/>
+      <w:lvlText w:val=""/>
+      <w:lvlJc w:val="left"/>
+      <w:pPr>
+        <w:ind w:left="4320" w:hanging="360"/>
+      </w:pPr>
+      <w:rPr>
+        <w:rFonts w:ascii="Wingdings" w:hAnsi="Wingdings" w:hint="default"/>
+      </w:rPr>
+    </w:lvl>
+    <w:lvl w:ilvl="6" w:tplc="04160001" w:tentative="1">
+      <w:start w:val="1"/>
+      <w:numFmt w:val="bullet"/>
+      <w:lvlText w:val=""/>
+      <w:lvlJc w:val="left"/>
+      <w:pPr>
+        <w:ind w:left="5040" w:hanging="360"/>
+      </w:pPr>
+      <w:rPr>
+        <w:rFonts w:ascii="Symbol" w:hAnsi="Symbol" w:hint="default"/>
+      </w:rPr>
+    </w:lvl>
+    <w:lvl w:ilvl="7" w:tplc="04160003" w:tentative="1">
+      <w:start w:val="1"/>
+      <w:numFmt w:val="bullet"/>
+      <w:lvlText w:val="o"/>
+      <w:lvlJc w:val="left"/>
+      <w:pPr>
+        <w:ind w:left="5760" w:hanging="360"/>
+      </w:pPr>
+      <w:rPr>
+        <w:rFonts w:ascii="Courier New" w:hAnsi="Courier New" w:cs="Courier New" w:hint="default"/>
+      </w:rPr>
+    </w:lvl>
+    <w:lvl w:ilvl="8" w:tplc="04160005" w:tentative="1">
+      <w:start w:val="1"/>
+      <w:numFmt w:val="bullet"/>
+      <w:lvlText w:val=""/>
+      <w:lvlJc w:val="left"/>
+      <w:pPr>
+        <w:ind w:left="6480" w:hanging="360"/>
+      </w:pPr>
+      <w:rPr>
+        <w:rFonts w:ascii="Wingdings" w:hAnsi="Wingdings" w:hint="default"/>
+      </w:rPr>
+    </w:lvl>
+  </w:abstractNum>
   <w:abstractNum w:abstractNumId="3" w15:restartNumberingAfterBreak="0">
-    <w:nsid w:val="5881083F"/>
+    <w:nsid w:val="421733B9"/>
     <w:multiLevelType w:val="multilevel"/>
-    <w:tmpl w:val="369EB39C"/>
+    <w:tmpl w:val="E8662CB6"/>
     <w:lvl w:ilvl="0">
       <w:start w:val="1"/>
       <w:numFmt w:val="bullet"/>
@@ -5971,9 +5946,9 @@
     </w:lvl>
   </w:abstractNum>
   <w:abstractNum w:abstractNumId="4" w15:restartNumberingAfterBreak="0">
-    <w:nsid w:val="6CE30854"/>
+    <w:nsid w:val="5881083F"/>
     <w:multiLevelType w:val="multilevel"/>
-    <w:tmpl w:val="4F362632"/>
+    <w:tmpl w:val="369EB39C"/>
     <w:lvl w:ilvl="0">
       <w:start w:val="1"/>
       <w:numFmt w:val="bullet"/>
@@ -6119,20 +6094,172 @@
       </w:rPr>
     </w:lvl>
   </w:abstractNum>
+  <w:abstractNum w:abstractNumId="5" w15:restartNumberingAfterBreak="0">
+    <w:nsid w:val="6CE30854"/>
+    <w:multiLevelType w:val="multilevel"/>
+    <w:tmpl w:val="4F362632"/>
+    <w:lvl w:ilvl="0">
+      <w:start w:val="1"/>
+      <w:numFmt w:val="bullet"/>
+      <w:lvlText w:val=""/>
+      <w:lvlJc w:val="left"/>
+      <w:pPr>
+        <w:tabs>
+          <w:tab w:val="num" w:pos="720"/>
+        </w:tabs>
+        <w:ind w:left="720" w:hanging="360"/>
+      </w:pPr>
+      <w:rPr>
+        <w:rFonts w:ascii="Symbol" w:hAnsi="Symbol" w:hint="default"/>
+        <w:sz w:val="20"/>
+      </w:rPr>
+    </w:lvl>
+    <w:lvl w:ilvl="1" w:tentative="1">
+      <w:start w:val="1"/>
+      <w:numFmt w:val="bullet"/>
+      <w:lvlText w:val=""/>
+      <w:lvlJc w:val="left"/>
+      <w:pPr>
+        <w:tabs>
+          <w:tab w:val="num" w:pos="1440"/>
+        </w:tabs>
+        <w:ind w:left="1440" w:hanging="360"/>
+      </w:pPr>
+      <w:rPr>
+        <w:rFonts w:ascii="Symbol" w:hAnsi="Symbol" w:hint="default"/>
+        <w:sz w:val="20"/>
+      </w:rPr>
+    </w:lvl>
+    <w:lvl w:ilvl="2" w:tentative="1">
+      <w:start w:val="1"/>
+      <w:numFmt w:val="bullet"/>
+      <w:lvlText w:val=""/>
+      <w:lvlJc w:val="left"/>
+      <w:pPr>
+        <w:tabs>
+          <w:tab w:val="num" w:pos="2160"/>
+        </w:tabs>
+        <w:ind w:left="2160" w:hanging="360"/>
+      </w:pPr>
+      <w:rPr>
+        <w:rFonts w:ascii="Symbol" w:hAnsi="Symbol" w:hint="default"/>
+        <w:sz w:val="20"/>
+      </w:rPr>
+    </w:lvl>
+    <w:lvl w:ilvl="3" w:tentative="1">
+      <w:start w:val="1"/>
+      <w:numFmt w:val="bullet"/>
+      <w:lvlText w:val=""/>
+      <w:lvlJc w:val="left"/>
+      <w:pPr>
+        <w:tabs>
+          <w:tab w:val="num" w:pos="2880"/>
+        </w:tabs>
+        <w:ind w:left="2880" w:hanging="360"/>
+      </w:pPr>
+      <w:rPr>
+        <w:rFonts w:ascii="Symbol" w:hAnsi="Symbol" w:hint="default"/>
+        <w:sz w:val="20"/>
+      </w:rPr>
+    </w:lvl>
+    <w:lvl w:ilvl="4" w:tentative="1">
+      <w:start w:val="1"/>
+      <w:numFmt w:val="bullet"/>
+      <w:lvlText w:val=""/>
+      <w:lvlJc w:val="left"/>
+      <w:pPr>
+        <w:tabs>
+          <w:tab w:val="num" w:pos="3600"/>
+        </w:tabs>
+        <w:ind w:left="3600" w:hanging="360"/>
+      </w:pPr>
+      <w:rPr>
+        <w:rFonts w:ascii="Symbol" w:hAnsi="Symbol" w:hint="default"/>
+        <w:sz w:val="20"/>
+      </w:rPr>
+    </w:lvl>
+    <w:lvl w:ilvl="5" w:tentative="1">
+      <w:start w:val="1"/>
+      <w:numFmt w:val="bullet"/>
+      <w:lvlText w:val=""/>
+      <w:lvlJc w:val="left"/>
+      <w:pPr>
+        <w:tabs>
+          <w:tab w:val="num" w:pos="4320"/>
+        </w:tabs>
+        <w:ind w:left="4320" w:hanging="360"/>
+      </w:pPr>
+      <w:rPr>
+        <w:rFonts w:ascii="Symbol" w:hAnsi="Symbol" w:hint="default"/>
+        <w:sz w:val="20"/>
+      </w:rPr>
+    </w:lvl>
+    <w:lvl w:ilvl="6" w:tentative="1">
+      <w:start w:val="1"/>
+      <w:numFmt w:val="bullet"/>
+      <w:lvlText w:val=""/>
+      <w:lvlJc w:val="left"/>
+      <w:pPr>
+        <w:tabs>
+          <w:tab w:val="num" w:pos="5040"/>
+        </w:tabs>
+        <w:ind w:left="5040" w:hanging="360"/>
+      </w:pPr>
+      <w:rPr>
+        <w:rFonts w:ascii="Symbol" w:hAnsi="Symbol" w:hint="default"/>
+        <w:sz w:val="20"/>
+      </w:rPr>
+    </w:lvl>
+    <w:lvl w:ilvl="7" w:tentative="1">
+      <w:start w:val="1"/>
+      <w:numFmt w:val="bullet"/>
+      <w:lvlText w:val=""/>
+      <w:lvlJc w:val="left"/>
+      <w:pPr>
+        <w:tabs>
+          <w:tab w:val="num" w:pos="5760"/>
+        </w:tabs>
+        <w:ind w:left="5760" w:hanging="360"/>
+      </w:pPr>
+      <w:rPr>
+        <w:rFonts w:ascii="Symbol" w:hAnsi="Symbol" w:hint="default"/>
+        <w:sz w:val="20"/>
+      </w:rPr>
+    </w:lvl>
+    <w:lvl w:ilvl="8" w:tentative="1">
+      <w:start w:val="1"/>
+      <w:numFmt w:val="bullet"/>
+      <w:lvlText w:val=""/>
+      <w:lvlJc w:val="left"/>
+      <w:pPr>
+        <w:tabs>
+          <w:tab w:val="num" w:pos="6480"/>
+        </w:tabs>
+        <w:ind w:left="6480" w:hanging="360"/>
+      </w:pPr>
+      <w:rPr>
+        <w:rFonts w:ascii="Symbol" w:hAnsi="Symbol" w:hint="default"/>
+        <w:sz w:val="20"/>
+      </w:rPr>
+    </w:lvl>
+  </w:abstractNum>
   <w:num w:numId="1" w16cid:durableId="1844972552">
-    <w:abstractNumId w:val="0"/>
+    <w:abstractNumId w:val="1"/>
   </w:num>
   <w:num w:numId="2" w16cid:durableId="268896214">
-    <w:abstractNumId w:val="1"/>
+    <w:abstractNumId w:val="2"/>
   </w:num>
   <w:num w:numId="3" w16cid:durableId="1473865490">
-    <w:abstractNumId w:val="2"/>
+    <w:abstractNumId w:val="3"/>
   </w:num>
   <w:num w:numId="4" w16cid:durableId="2082022958">
-    <w:abstractNumId w:val="3"/>
+    <w:abstractNumId w:val="4"/>
   </w:num>
   <w:num w:numId="5" w16cid:durableId="1441946339">
-    <w:abstractNumId w:val="4"/>
+    <w:abstractNumId w:val="5"/>
+  </w:num>
+  <w:num w:numId="6" w16cid:durableId="1925382839">
+    <w:abstractNumId w:val="0"/>
   </w:num>
 </w:numbering>
 </file>

</xml_diff>